<commit_message>
Ersetzen und ergänzen der templates
Neue Vorlagen ersetzt und zusätzlich Reflexion ergänzt.
</commit_message>
<xml_diff>
--- a/templates/MD_Ausblick.docx
+++ b/templates/MD_Ausblick.docx
@@ -109,6 +109,9 @@
           <w:tcPr>
             <w:tcW w:w="1560" w:type="dxa"/>
             <w:tcBorders>
+              <w:top w:val="single" w:sz="4" w:space="0" w:color="FFFFFF" w:themeColor="background1"/>
+              <w:left w:val="single" w:sz="4" w:space="0" w:color="FFFFFF" w:themeColor="background1"/>
+              <w:bottom w:val="single" w:sz="4" w:space="0" w:color="FFFFFF" w:themeColor="background1"/>
               <w:right w:val="single" w:sz="4" w:space="0" w:color="BFBFBF" w:themeColor="background1" w:themeShade="BF"/>
             </w:tcBorders>
             <w:vAlign w:val="center"/>
@@ -180,7 +183,9 @@
           <w:tcPr>
             <w:tcW w:w="850" w:type="dxa"/>
             <w:tcBorders>
+              <w:top w:val="single" w:sz="4" w:space="0" w:color="FFFFFF" w:themeColor="background1"/>
               <w:left w:val="single" w:sz="4" w:space="0" w:color="BFBFBF" w:themeColor="background1" w:themeShade="BF"/>
+              <w:bottom w:val="single" w:sz="4" w:space="0" w:color="FFFFFF" w:themeColor="background1"/>
               <w:right w:val="single" w:sz="4" w:space="0" w:color="BFBFBF" w:themeColor="background1" w:themeShade="BF"/>
             </w:tcBorders>
             <w:vAlign w:val="center"/>
@@ -257,6 +262,9 @@
           <w:tcPr>
             <w:tcW w:w="1560" w:type="dxa"/>
             <w:tcBorders>
+              <w:top w:val="single" w:sz="4" w:space="0" w:color="FFFFFF" w:themeColor="background1"/>
+              <w:left w:val="single" w:sz="4" w:space="0" w:color="FFFFFF" w:themeColor="background1"/>
+              <w:bottom w:val="single" w:sz="4" w:space="0" w:color="FFFFFF" w:themeColor="background1"/>
               <w:right w:val="single" w:sz="4" w:space="0" w:color="BFBFBF" w:themeColor="background1" w:themeShade="BF"/>
             </w:tcBorders>
             <w:vAlign w:val="center"/>
@@ -320,7 +328,9 @@
           <w:tcPr>
             <w:tcW w:w="850" w:type="dxa"/>
             <w:tcBorders>
+              <w:top w:val="single" w:sz="4" w:space="0" w:color="FFFFFF" w:themeColor="background1"/>
               <w:left w:val="single" w:sz="4" w:space="0" w:color="BFBFBF" w:themeColor="background1" w:themeShade="BF"/>
+              <w:bottom w:val="single" w:sz="4" w:space="0" w:color="FFFFFF" w:themeColor="background1"/>
               <w:right w:val="single" w:sz="4" w:space="0" w:color="BFBFBF" w:themeColor="background1" w:themeShade="BF"/>
             </w:tcBorders>
             <w:vAlign w:val="center"/>
@@ -388,6 +398,9 @@
           <w:tcPr>
             <w:tcW w:w="1560" w:type="dxa"/>
             <w:tcBorders>
+              <w:top w:val="single" w:sz="4" w:space="0" w:color="FFFFFF" w:themeColor="background1"/>
+              <w:left w:val="single" w:sz="4" w:space="0" w:color="FFFFFF" w:themeColor="background1"/>
+              <w:bottom w:val="single" w:sz="4" w:space="0" w:color="FFFFFF" w:themeColor="background1"/>
               <w:right w:val="single" w:sz="4" w:space="0" w:color="BFBFBF" w:themeColor="background1" w:themeShade="BF"/>
             </w:tcBorders>
             <w:vAlign w:val="center"/>
@@ -454,7 +467,9 @@
           <w:tcPr>
             <w:tcW w:w="850" w:type="dxa"/>
             <w:tcBorders>
+              <w:top w:val="single" w:sz="4" w:space="0" w:color="FFFFFF" w:themeColor="background1"/>
               <w:left w:val="single" w:sz="4" w:space="0" w:color="BFBFBF" w:themeColor="background1" w:themeShade="BF"/>
+              <w:bottom w:val="single" w:sz="4" w:space="0" w:color="FFFFFF" w:themeColor="background1"/>
               <w:right w:val="single" w:sz="4" w:space="0" w:color="BFBFBF" w:themeColor="background1" w:themeShade="BF"/>
             </w:tcBorders>
             <w:vAlign w:val="center"/>
@@ -562,6 +577,9 @@
           <w:tcPr>
             <w:tcW w:w="1547" w:type="dxa"/>
             <w:tcBorders>
+              <w:top w:val="single" w:sz="4" w:space="0" w:color="FFFFFF"/>
+              <w:left w:val="single" w:sz="4" w:space="0" w:color="FFFFFF"/>
+              <w:bottom w:val="single" w:sz="4" w:space="0" w:color="FFFFFF"/>
               <w:right w:val="single" w:sz="4" w:space="0" w:color="BFBFBF"/>
             </w:tcBorders>
             <w:vAlign w:val="center"/>
@@ -637,7 +655,9 @@
           <w:tcPr>
             <w:tcW w:w="709" w:type="dxa"/>
             <w:tcBorders>
+              <w:top w:val="single" w:sz="4" w:space="0" w:color="FFFFFF"/>
               <w:left w:val="single" w:sz="4" w:space="0" w:color="BFBFBF"/>
+              <w:bottom w:val="single" w:sz="4" w:space="0" w:color="FFFFFF"/>
               <w:right w:val="single" w:sz="4" w:space="0" w:color="BFBFBF"/>
             </w:tcBorders>
             <w:vAlign w:val="center"/>
@@ -711,7 +731,10 @@
           <w:tcPr>
             <w:tcW w:w="709" w:type="dxa"/>
             <w:tcBorders>
+              <w:top w:val="single" w:sz="4" w:space="0" w:color="FFFFFF" w:themeColor="background1"/>
               <w:left w:val="single" w:sz="4" w:space="0" w:color="BFBFBF"/>
+              <w:bottom w:val="single" w:sz="4" w:space="0" w:color="FFFFFF"/>
+              <w:right w:val="single" w:sz="4" w:space="0" w:color="FFFFFF" w:themeColor="background1"/>
             </w:tcBorders>
             <w:vAlign w:val="center"/>
           </w:tcPr>
@@ -729,6 +752,9 @@
           <w:tcPr>
             <w:tcW w:w="1701" w:type="dxa"/>
             <w:tcBorders>
+              <w:top w:val="single" w:sz="4" w:space="0" w:color="FFFFFF"/>
+              <w:left w:val="single" w:sz="4" w:space="0" w:color="FFFFFF" w:themeColor="background1"/>
+              <w:bottom w:val="single" w:sz="4" w:space="0" w:color="FFFFFF"/>
               <w:right w:val="single" w:sz="4" w:space="0" w:color="BFBFBF"/>
             </w:tcBorders>
             <w:vAlign w:val="center"/>
@@ -844,7 +870,10 @@
             <w:cnfStyle w:val="001000000000" w:firstRow="0" w:lastRow="0" w:firstColumn="1" w:lastColumn="0" w:oddVBand="0" w:evenVBand="0" w:oddHBand="0" w:evenHBand="0" w:firstRowFirstColumn="0" w:firstRowLastColumn="0" w:lastRowFirstColumn="0" w:lastRowLastColumn="0"/>
             <w:tcW w:w="8647" w:type="dxa"/>
             <w:tcBorders>
+              <w:top w:val="single" w:sz="4" w:space="0" w:color="FFFFFF"/>
+              <w:left w:val="single" w:sz="4" w:space="0" w:color="FFFFFF"/>
               <w:bottom w:val="single" w:sz="4" w:space="0" w:color="BFBFBF" w:themeColor="background1" w:themeShade="BF"/>
+              <w:right w:val="single" w:sz="4" w:space="0" w:color="FFFFFF"/>
             </w:tcBorders>
           </w:tcPr>
           <w:p>
@@ -921,6 +950,8 @@
                 <w:r>
                   <w:rPr>
                     <w:rStyle w:val="Platzhaltertext"/>
+                    <w:sz w:val="18"/>
+                    <w:szCs w:val="18"/>
                   </w:rPr>
                   <w:t> </w:t>
                 </w:r>
@@ -1062,7 +1093,7 @@
           <w:tcPr>
             <w:tcW w:w="2263" w:type="dxa"/>
             <w:tcBorders>
-              <w:top w:val="nil"/>
+              <w:top w:val="single" w:sz="4" w:space="0" w:color="FFFFFF"/>
               <w:left w:val="single" w:sz="8" w:space="0" w:color="FFFFFF" w:themeColor="background1"/>
               <w:bottom w:val="single" w:sz="4" w:space="0" w:color="BFBFBF"/>
               <w:right w:val="single" w:sz="8" w:space="0" w:color="FFFFFF" w:themeColor="background1"/>
@@ -1098,7 +1129,7 @@
           <w:tcPr>
             <w:tcW w:w="2552" w:type="dxa"/>
             <w:tcBorders>
-              <w:top w:val="nil"/>
+              <w:top w:val="single" w:sz="4" w:space="0" w:color="FFFFFF"/>
               <w:left w:val="single" w:sz="8" w:space="0" w:color="FFFFFF" w:themeColor="background1"/>
               <w:bottom w:val="single" w:sz="4" w:space="0" w:color="BFBFBF"/>
               <w:right w:val="single" w:sz="8" w:space="0" w:color="FFFFFF" w:themeColor="background1"/>
@@ -1134,7 +1165,7 @@
           <w:tcPr>
             <w:tcW w:w="2693" w:type="dxa"/>
             <w:tcBorders>
-              <w:top w:val="nil"/>
+              <w:top w:val="single" w:sz="4" w:space="0" w:color="FFFFFF"/>
               <w:left w:val="single" w:sz="8" w:space="0" w:color="FFFFFF" w:themeColor="background1"/>
               <w:bottom w:val="single" w:sz="4" w:space="0" w:color="BFBFBF"/>
               <w:right w:val="single" w:sz="8" w:space="0" w:color="FFFFFF" w:themeColor="background1"/>
@@ -1170,7 +1201,7 @@
           <w:tcPr>
             <w:tcW w:w="1134" w:type="dxa"/>
             <w:tcBorders>
-              <w:top w:val="nil"/>
+              <w:top w:val="single" w:sz="4" w:space="0" w:color="FFFFFF"/>
               <w:left w:val="single" w:sz="8" w:space="0" w:color="FFFFFF" w:themeColor="background1"/>
               <w:bottom w:val="single" w:sz="4" w:space="0" w:color="BFBFBF"/>
               <w:right w:val="single" w:sz="8" w:space="0" w:color="FFFFFF" w:themeColor="background1"/>
@@ -1838,7 +1869,9 @@
             <w:tcW w:w="8647" w:type="dxa"/>
             <w:tcBorders>
               <w:top w:val="single" w:sz="8" w:space="0" w:color="FFFFFF" w:themeColor="background1"/>
+              <w:left w:val="single" w:sz="4" w:space="0" w:color="FFFFFF"/>
               <w:bottom w:val="single" w:sz="4" w:space="0" w:color="BFBFBF" w:themeColor="background1" w:themeShade="BF"/>
+              <w:right w:val="single" w:sz="4" w:space="0" w:color="FFFFFF"/>
             </w:tcBorders>
           </w:tcPr>
           <w:p>
@@ -1936,6 +1969,8 @@
                 <w:r>
                   <w:rPr>
                     <w:rStyle w:val="Platzhaltertext"/>
+                    <w:sz w:val="18"/>
+                    <w:szCs w:val="18"/>
                   </w:rPr>
                   <w:t> </w:t>
                 </w:r>
@@ -2022,10 +2057,10 @@
           <w:tcPr>
             <w:tcW w:w="8647" w:type="dxa"/>
             <w:tcBorders>
-              <w:top w:val="nil"/>
-              <w:left w:val="nil"/>
-              <w:bottom w:val="nil"/>
-              <w:right w:val="nil"/>
+              <w:top w:val="single" w:sz="4" w:space="0" w:color="FFFFFF"/>
+              <w:left w:val="single" w:sz="4" w:space="0" w:color="FFFFFF"/>
+              <w:bottom w:val="single" w:sz="4" w:space="0" w:color="FFFFFF"/>
+              <w:right w:val="single" w:sz="4" w:space="0" w:color="FFFFFF"/>
             </w:tcBorders>
             <w:shd w:val="clear" w:color="auto" w:fill="FCE0CC" w:themeFill="background2" w:themeFillTint="33"/>
             <w:vAlign w:val="center"/>
@@ -2081,33 +2116,49 @@
               </w:rPr>
               <w:t xml:space="preserve"> </w:t>
             </w:r>
+            <w:bookmarkStart w:id="2" w:name="_Hlk210124267"/>
             <w:r>
               <w:rPr>
                 <w:sz w:val="16"/>
                 <w:szCs w:val="16"/>
               </w:rPr>
-              <w:t xml:space="preserve">Das </w:t>
+              <w:t>Human Resources &amp; Entwicklung</w:t>
             </w:r>
             <w:r>
               <w:rPr>
                 <w:sz w:val="16"/>
                 <w:szCs w:val="16"/>
               </w:rPr>
-              <w:t>HR-Management</w:t>
+              <w:t xml:space="preserve"> </w:t>
+            </w:r>
+            <w:bookmarkEnd w:id="2"/>
+            <w:r>
+              <w:rPr>
+                <w:sz w:val="16"/>
+                <w:szCs w:val="16"/>
+              </w:rPr>
+              <w:t>empfiehlt</w:t>
             </w:r>
             <w:r>
               <w:rPr>
                 <w:sz w:val="16"/>
                 <w:szCs w:val="16"/>
               </w:rPr>
-              <w:t xml:space="preserve"> empfiehlt</w:t>
+              <w:t xml:space="preserve"> </w:t>
             </w:r>
             <w:r>
               <w:rPr>
                 <w:sz w:val="16"/>
                 <w:szCs w:val="16"/>
               </w:rPr>
-              <w:t xml:space="preserve"> zwei bis drei. </w:t>
+              <w:t>ein bis zwei</w:t>
+            </w:r>
+            <w:r>
+              <w:rPr>
+                <w:sz w:val="16"/>
+                <w:szCs w:val="16"/>
+              </w:rPr>
+              <w:t xml:space="preserve">. </w:t>
             </w:r>
             <w:r>
               <w:rPr>
@@ -2286,14 +2337,14 @@
           <w:tcPr>
             <w:tcW w:w="1276" w:type="dxa"/>
             <w:tcBorders>
-              <w:top w:val="nil"/>
-              <w:left w:val="nil"/>
+              <w:top w:val="single" w:sz="4" w:space="0" w:color="FFFFFF"/>
+              <w:left w:val="single" w:sz="4" w:space="0" w:color="FFFFFF"/>
               <w:bottom w:val="single" w:sz="4" w:space="0" w:color="992AA2"/>
-              <w:right w:val="nil"/>
+              <w:right w:val="single" w:sz="4" w:space="0" w:color="FFFFFF"/>
             </w:tcBorders>
             <w:vAlign w:val="bottom"/>
           </w:tcPr>
-          <w:bookmarkStart w:id="2" w:name="_Hlk209008304"/>
+          <w:bookmarkStart w:id="3" w:name="_Hlk209008304"/>
           <w:p>
             <w:pPr>
               <w:spacing w:before="60" w:after="60"/>
@@ -2362,10 +2413,10 @@
           <w:tcPr>
             <w:tcW w:w="7371" w:type="dxa"/>
             <w:tcBorders>
-              <w:top w:val="nil"/>
-              <w:left w:val="nil"/>
+              <w:top w:val="single" w:sz="4" w:space="0" w:color="FFFFFF"/>
+              <w:left w:val="single" w:sz="4" w:space="0" w:color="FFFFFF"/>
               <w:bottom w:val="single" w:sz="4" w:space="0" w:color="992AA2"/>
-              <w:right w:val="nil"/>
+              <w:right w:val="single" w:sz="4" w:space="0" w:color="FFFFFF"/>
             </w:tcBorders>
             <w:vAlign w:val="center"/>
           </w:tcPr>
@@ -2415,7 +2466,7 @@
           </w:p>
         </w:tc>
       </w:tr>
-      <w:bookmarkEnd w:id="2"/>
+      <w:bookmarkEnd w:id="3"/>
     </w:tbl>
     <w:p>
       <w:pPr>
@@ -2452,10 +2503,10 @@
             <w:tcW w:w="8642" w:type="dxa"/>
             <w:gridSpan w:val="4"/>
             <w:tcBorders>
-              <w:top w:val="nil"/>
-              <w:left w:val="nil"/>
+              <w:top w:val="single" w:sz="4" w:space="0" w:color="FFFFFF"/>
+              <w:left w:val="single" w:sz="4" w:space="0" w:color="FFFFFF"/>
               <w:bottom w:val="nil"/>
-              <w:right w:val="nil"/>
+              <w:right w:val="single" w:sz="4" w:space="0" w:color="FFFFFF"/>
             </w:tcBorders>
           </w:tcPr>
           <w:p>
@@ -2497,7 +2548,7 @@
           <w:tcPr>
             <w:tcW w:w="2263" w:type="dxa"/>
             <w:tcBorders>
-              <w:top w:val="nil"/>
+              <w:top w:val="single" w:sz="4" w:space="0" w:color="FFFFFF"/>
               <w:left w:val="single" w:sz="8" w:space="0" w:color="FFFFFF" w:themeColor="background1"/>
               <w:bottom w:val="single" w:sz="4" w:space="0" w:color="BFBFBF"/>
               <w:right w:val="single" w:sz="8" w:space="0" w:color="FFFFFF" w:themeColor="background1"/>
@@ -2542,7 +2593,7 @@
           <w:tcPr>
             <w:tcW w:w="2552" w:type="dxa"/>
             <w:tcBorders>
-              <w:top w:val="nil"/>
+              <w:top w:val="single" w:sz="4" w:space="0" w:color="FFFFFF"/>
               <w:left w:val="single" w:sz="8" w:space="0" w:color="FFFFFF" w:themeColor="background1"/>
               <w:bottom w:val="single" w:sz="4" w:space="0" w:color="BFBFBF"/>
               <w:right w:val="single" w:sz="8" w:space="0" w:color="FFFFFF" w:themeColor="background1"/>
@@ -2578,7 +2629,7 @@
           <w:tcPr>
             <w:tcW w:w="2693" w:type="dxa"/>
             <w:tcBorders>
-              <w:top w:val="nil"/>
+              <w:top w:val="single" w:sz="4" w:space="0" w:color="FFFFFF"/>
               <w:left w:val="single" w:sz="8" w:space="0" w:color="FFFFFF" w:themeColor="background1"/>
               <w:bottom w:val="single" w:sz="4" w:space="0" w:color="BFBFBF"/>
               <w:right w:val="single" w:sz="8" w:space="0" w:color="FFFFFF" w:themeColor="background1"/>
@@ -2614,7 +2665,7 @@
           <w:tcPr>
             <w:tcW w:w="1134" w:type="dxa"/>
             <w:tcBorders>
-              <w:top w:val="nil"/>
+              <w:top w:val="single" w:sz="4" w:space="0" w:color="FFFFFF"/>
               <w:left w:val="single" w:sz="8" w:space="0" w:color="FFFFFF" w:themeColor="background1"/>
               <w:bottom w:val="single" w:sz="4" w:space="0" w:color="BFBFBF"/>
               <w:right w:val="single" w:sz="8" w:space="0" w:color="FFFFFF" w:themeColor="background1"/>
@@ -2888,10 +2939,10 @@
             <w:tcW w:w="8642" w:type="dxa"/>
             <w:gridSpan w:val="4"/>
             <w:tcBorders>
-              <w:top w:val="nil"/>
-              <w:left w:val="nil"/>
+              <w:top w:val="single" w:sz="4" w:space="0" w:color="FFFFFF"/>
+              <w:left w:val="single" w:sz="4" w:space="0" w:color="FFFFFF"/>
               <w:bottom w:val="nil"/>
-              <w:right w:val="nil"/>
+              <w:right w:val="single" w:sz="4" w:space="0" w:color="FFFFFF"/>
             </w:tcBorders>
           </w:tcPr>
           <w:p>
@@ -2933,7 +2984,7 @@
           <w:tcPr>
             <w:tcW w:w="2263" w:type="dxa"/>
             <w:tcBorders>
-              <w:top w:val="nil"/>
+              <w:top w:val="single" w:sz="4" w:space="0" w:color="FFFFFF"/>
               <w:left w:val="single" w:sz="8" w:space="0" w:color="FFFFFF" w:themeColor="background1"/>
               <w:bottom w:val="single" w:sz="4" w:space="0" w:color="BFBFBF"/>
               <w:right w:val="single" w:sz="8" w:space="0" w:color="FFFFFF" w:themeColor="background1"/>
@@ -2978,7 +3029,7 @@
           <w:tcPr>
             <w:tcW w:w="2552" w:type="dxa"/>
             <w:tcBorders>
-              <w:top w:val="nil"/>
+              <w:top w:val="single" w:sz="4" w:space="0" w:color="FFFFFF"/>
               <w:left w:val="single" w:sz="8" w:space="0" w:color="FFFFFF" w:themeColor="background1"/>
               <w:bottom w:val="single" w:sz="4" w:space="0" w:color="BFBFBF"/>
               <w:right w:val="single" w:sz="8" w:space="0" w:color="FFFFFF" w:themeColor="background1"/>
@@ -3014,7 +3065,7 @@
           <w:tcPr>
             <w:tcW w:w="2693" w:type="dxa"/>
             <w:tcBorders>
-              <w:top w:val="nil"/>
+              <w:top w:val="single" w:sz="4" w:space="0" w:color="FFFFFF"/>
               <w:left w:val="single" w:sz="8" w:space="0" w:color="FFFFFF" w:themeColor="background1"/>
               <w:bottom w:val="single" w:sz="4" w:space="0" w:color="BFBFBF"/>
               <w:right w:val="single" w:sz="8" w:space="0" w:color="FFFFFF" w:themeColor="background1"/>
@@ -3050,7 +3101,7 @@
           <w:tcPr>
             <w:tcW w:w="1134" w:type="dxa"/>
             <w:tcBorders>
-              <w:top w:val="nil"/>
+              <w:top w:val="single" w:sz="4" w:space="0" w:color="FFFFFF"/>
               <w:left w:val="single" w:sz="8" w:space="0" w:color="FFFFFF" w:themeColor="background1"/>
               <w:bottom w:val="single" w:sz="4" w:space="0" w:color="BFBFBF"/>
               <w:right w:val="single" w:sz="8" w:space="0" w:color="FFFFFF" w:themeColor="background1"/>
@@ -3324,10 +3375,10 @@
             <w:tcW w:w="8642" w:type="dxa"/>
             <w:gridSpan w:val="4"/>
             <w:tcBorders>
-              <w:top w:val="nil"/>
-              <w:left w:val="nil"/>
+              <w:top w:val="single" w:sz="4" w:space="0" w:color="FFFFFF"/>
+              <w:left w:val="single" w:sz="4" w:space="0" w:color="FFFFFF"/>
               <w:bottom w:val="nil"/>
-              <w:right w:val="nil"/>
+              <w:right w:val="single" w:sz="4" w:space="0" w:color="FFFFFF"/>
             </w:tcBorders>
           </w:tcPr>
           <w:p>
@@ -3369,7 +3420,7 @@
           <w:tcPr>
             <w:tcW w:w="2263" w:type="dxa"/>
             <w:tcBorders>
-              <w:top w:val="nil"/>
+              <w:top w:val="single" w:sz="4" w:space="0" w:color="FFFFFF"/>
               <w:left w:val="single" w:sz="8" w:space="0" w:color="FFFFFF" w:themeColor="background1"/>
               <w:bottom w:val="single" w:sz="4" w:space="0" w:color="BFBFBF"/>
               <w:right w:val="single" w:sz="8" w:space="0" w:color="FFFFFF" w:themeColor="background1"/>
@@ -3414,7 +3465,7 @@
           <w:tcPr>
             <w:tcW w:w="2552" w:type="dxa"/>
             <w:tcBorders>
-              <w:top w:val="nil"/>
+              <w:top w:val="single" w:sz="4" w:space="0" w:color="FFFFFF"/>
               <w:left w:val="single" w:sz="8" w:space="0" w:color="FFFFFF" w:themeColor="background1"/>
               <w:bottom w:val="single" w:sz="4" w:space="0" w:color="BFBFBF"/>
               <w:right w:val="single" w:sz="8" w:space="0" w:color="FFFFFF" w:themeColor="background1"/>
@@ -3450,7 +3501,7 @@
           <w:tcPr>
             <w:tcW w:w="2693" w:type="dxa"/>
             <w:tcBorders>
-              <w:top w:val="nil"/>
+              <w:top w:val="single" w:sz="4" w:space="0" w:color="FFFFFF"/>
               <w:left w:val="single" w:sz="8" w:space="0" w:color="FFFFFF" w:themeColor="background1"/>
               <w:bottom w:val="single" w:sz="4" w:space="0" w:color="BFBFBF"/>
               <w:right w:val="single" w:sz="8" w:space="0" w:color="FFFFFF" w:themeColor="background1"/>
@@ -3486,7 +3537,7 @@
           <w:tcPr>
             <w:tcW w:w="1134" w:type="dxa"/>
             <w:tcBorders>
-              <w:top w:val="nil"/>
+              <w:top w:val="single" w:sz="4" w:space="0" w:color="FFFFFF"/>
               <w:left w:val="single" w:sz="8" w:space="0" w:color="FFFFFF" w:themeColor="background1"/>
               <w:bottom w:val="single" w:sz="4" w:space="0" w:color="BFBFBF"/>
               <w:right w:val="single" w:sz="8" w:space="0" w:color="FFFFFF" w:themeColor="background1"/>
@@ -3764,10 +3815,10 @@
           <w:tcPr>
             <w:tcW w:w="1276" w:type="dxa"/>
             <w:tcBorders>
-              <w:top w:val="nil"/>
-              <w:left w:val="nil"/>
+              <w:top w:val="single" w:sz="4" w:space="0" w:color="FFFFFF"/>
+              <w:left w:val="single" w:sz="4" w:space="0" w:color="FFFFFF"/>
               <w:bottom w:val="single" w:sz="4" w:space="0" w:color="003B5E"/>
-              <w:right w:val="nil"/>
+              <w:right w:val="single" w:sz="4" w:space="0" w:color="FFFFFF"/>
             </w:tcBorders>
             <w:vAlign w:val="bottom"/>
           </w:tcPr>
@@ -3780,7 +3831,7 @@
                 <w:szCs w:val="16"/>
               </w:rPr>
             </w:pPr>
-            <w:bookmarkStart w:id="3" w:name="_Hlk209008326"/>
+            <w:bookmarkStart w:id="4" w:name="_Hlk209008326"/>
             <w:r>
               <w:rPr>
                 <w:noProof/>
@@ -3850,10 +3901,10 @@
           <w:tcPr>
             <w:tcW w:w="7371" w:type="dxa"/>
             <w:tcBorders>
-              <w:top w:val="nil"/>
-              <w:left w:val="nil"/>
+              <w:top w:val="single" w:sz="4" w:space="0" w:color="FFFFFF"/>
+              <w:left w:val="single" w:sz="4" w:space="0" w:color="FFFFFF"/>
               <w:bottom w:val="single" w:sz="4" w:space="0" w:color="003B5E" w:themeColor="accent1" w:themeShade="80"/>
-              <w:right w:val="nil"/>
+              <w:right w:val="single" w:sz="4" w:space="0" w:color="FFFFFF"/>
             </w:tcBorders>
             <w:vAlign w:val="center"/>
           </w:tcPr>
@@ -3905,7 +3956,7 @@
           </w:p>
         </w:tc>
       </w:tr>
-      <w:bookmarkEnd w:id="3"/>
+      <w:bookmarkEnd w:id="4"/>
     </w:tbl>
     <w:p>
       <w:pPr>
@@ -3942,10 +3993,10 @@
             <w:tcW w:w="8642" w:type="dxa"/>
             <w:gridSpan w:val="4"/>
             <w:tcBorders>
-              <w:top w:val="nil"/>
-              <w:left w:val="nil"/>
-              <w:bottom w:val="nil"/>
-              <w:right w:val="nil"/>
+              <w:top w:val="single" w:sz="4" w:space="0" w:color="FFFFFF"/>
+              <w:left w:val="single" w:sz="4" w:space="0" w:color="FFFFFF"/>
+              <w:bottom w:val="single" w:sz="4" w:space="0" w:color="FFFFFF"/>
+              <w:right w:val="single" w:sz="4" w:space="0" w:color="FFFFFF"/>
             </w:tcBorders>
           </w:tcPr>
           <w:p>
@@ -3989,7 +4040,7 @@
           <w:tcPr>
             <w:tcW w:w="2263" w:type="dxa"/>
             <w:tcBorders>
-              <w:top w:val="nil"/>
+              <w:top w:val="single" w:sz="4" w:space="0" w:color="FFFFFF"/>
               <w:left w:val="single" w:sz="8" w:space="0" w:color="FFFFFF" w:themeColor="background1"/>
               <w:bottom w:val="single" w:sz="4" w:space="0" w:color="BFBFBF"/>
               <w:right w:val="single" w:sz="8" w:space="0" w:color="FFFFFF" w:themeColor="background1"/>
@@ -4034,7 +4085,7 @@
           <w:tcPr>
             <w:tcW w:w="2552" w:type="dxa"/>
             <w:tcBorders>
-              <w:top w:val="nil"/>
+              <w:top w:val="single" w:sz="4" w:space="0" w:color="FFFFFF"/>
               <w:left w:val="single" w:sz="8" w:space="0" w:color="FFFFFF" w:themeColor="background1"/>
               <w:bottom w:val="single" w:sz="4" w:space="0" w:color="BFBFBF"/>
               <w:right w:val="single" w:sz="8" w:space="0" w:color="FFFFFF" w:themeColor="background1"/>
@@ -4070,7 +4121,7 @@
           <w:tcPr>
             <w:tcW w:w="2693" w:type="dxa"/>
             <w:tcBorders>
-              <w:top w:val="nil"/>
+              <w:top w:val="single" w:sz="4" w:space="0" w:color="FFFFFF"/>
               <w:left w:val="single" w:sz="8" w:space="0" w:color="FFFFFF" w:themeColor="background1"/>
               <w:bottom w:val="single" w:sz="4" w:space="0" w:color="BFBFBF"/>
               <w:right w:val="single" w:sz="8" w:space="0" w:color="FFFFFF" w:themeColor="background1"/>
@@ -4106,7 +4157,7 @@
           <w:tcPr>
             <w:tcW w:w="1134" w:type="dxa"/>
             <w:tcBorders>
-              <w:top w:val="nil"/>
+              <w:top w:val="single" w:sz="4" w:space="0" w:color="FFFFFF"/>
               <w:left w:val="single" w:sz="8" w:space="0" w:color="FFFFFF" w:themeColor="background1"/>
               <w:bottom w:val="single" w:sz="4" w:space="0" w:color="BFBFBF"/>
               <w:right w:val="single" w:sz="8" w:space="0" w:color="FFFFFF" w:themeColor="background1"/>
@@ -4380,10 +4431,10 @@
             <w:tcW w:w="8642" w:type="dxa"/>
             <w:gridSpan w:val="4"/>
             <w:tcBorders>
-              <w:top w:val="nil"/>
-              <w:left w:val="nil"/>
-              <w:bottom w:val="nil"/>
-              <w:right w:val="nil"/>
+              <w:top w:val="single" w:sz="4" w:space="0" w:color="FFFFFF"/>
+              <w:left w:val="single" w:sz="4" w:space="0" w:color="FFFFFF"/>
+              <w:bottom w:val="single" w:sz="4" w:space="0" w:color="FFFFFF"/>
+              <w:right w:val="single" w:sz="4" w:space="0" w:color="FFFFFF"/>
             </w:tcBorders>
           </w:tcPr>
           <w:p>
@@ -4436,7 +4487,7 @@
           <w:tcPr>
             <w:tcW w:w="2263" w:type="dxa"/>
             <w:tcBorders>
-              <w:top w:val="nil"/>
+              <w:top w:val="single" w:sz="4" w:space="0" w:color="FFFFFF"/>
               <w:left w:val="single" w:sz="8" w:space="0" w:color="FFFFFF" w:themeColor="background1"/>
               <w:bottom w:val="single" w:sz="4" w:space="0" w:color="BFBFBF"/>
               <w:right w:val="single" w:sz="8" w:space="0" w:color="FFFFFF" w:themeColor="background1"/>
@@ -4481,7 +4532,7 @@
           <w:tcPr>
             <w:tcW w:w="2552" w:type="dxa"/>
             <w:tcBorders>
-              <w:top w:val="nil"/>
+              <w:top w:val="single" w:sz="4" w:space="0" w:color="FFFFFF"/>
               <w:left w:val="single" w:sz="8" w:space="0" w:color="FFFFFF" w:themeColor="background1"/>
               <w:bottom w:val="single" w:sz="4" w:space="0" w:color="BFBFBF"/>
               <w:right w:val="single" w:sz="8" w:space="0" w:color="FFFFFF" w:themeColor="background1"/>
@@ -4517,7 +4568,7 @@
           <w:tcPr>
             <w:tcW w:w="2693" w:type="dxa"/>
             <w:tcBorders>
-              <w:top w:val="nil"/>
+              <w:top w:val="single" w:sz="4" w:space="0" w:color="FFFFFF"/>
               <w:left w:val="single" w:sz="8" w:space="0" w:color="FFFFFF" w:themeColor="background1"/>
               <w:bottom w:val="single" w:sz="4" w:space="0" w:color="BFBFBF"/>
               <w:right w:val="single" w:sz="8" w:space="0" w:color="FFFFFF" w:themeColor="background1"/>
@@ -4553,7 +4604,7 @@
           <w:tcPr>
             <w:tcW w:w="1134" w:type="dxa"/>
             <w:tcBorders>
-              <w:top w:val="nil"/>
+              <w:top w:val="single" w:sz="4" w:space="0" w:color="FFFFFF"/>
               <w:left w:val="single" w:sz="8" w:space="0" w:color="FFFFFF" w:themeColor="background1"/>
               <w:bottom w:val="single" w:sz="4" w:space="0" w:color="BFBFBF"/>
               <w:right w:val="single" w:sz="8" w:space="0" w:color="FFFFFF" w:themeColor="background1"/>
@@ -4827,10 +4878,10 @@
             <w:tcW w:w="8642" w:type="dxa"/>
             <w:gridSpan w:val="4"/>
             <w:tcBorders>
-              <w:top w:val="nil"/>
-              <w:left w:val="nil"/>
-              <w:bottom w:val="nil"/>
-              <w:right w:val="nil"/>
+              <w:top w:val="single" w:sz="4" w:space="0" w:color="FFFFFF"/>
+              <w:left w:val="single" w:sz="4" w:space="0" w:color="FFFFFF"/>
+              <w:bottom w:val="single" w:sz="4" w:space="0" w:color="FFFFFF"/>
+              <w:right w:val="single" w:sz="4" w:space="0" w:color="FFFFFF"/>
             </w:tcBorders>
           </w:tcPr>
           <w:p>
@@ -4874,7 +4925,7 @@
           <w:tcPr>
             <w:tcW w:w="2263" w:type="dxa"/>
             <w:tcBorders>
-              <w:top w:val="nil"/>
+              <w:top w:val="single" w:sz="4" w:space="0" w:color="FFFFFF"/>
               <w:left w:val="single" w:sz="8" w:space="0" w:color="FFFFFF" w:themeColor="background1"/>
               <w:bottom w:val="single" w:sz="4" w:space="0" w:color="BFBFBF"/>
               <w:right w:val="single" w:sz="8" w:space="0" w:color="FFFFFF" w:themeColor="background1"/>
@@ -4919,7 +4970,7 @@
           <w:tcPr>
             <w:tcW w:w="2552" w:type="dxa"/>
             <w:tcBorders>
-              <w:top w:val="nil"/>
+              <w:top w:val="single" w:sz="4" w:space="0" w:color="FFFFFF"/>
               <w:left w:val="single" w:sz="8" w:space="0" w:color="FFFFFF" w:themeColor="background1"/>
               <w:bottom w:val="single" w:sz="4" w:space="0" w:color="BFBFBF"/>
               <w:right w:val="single" w:sz="8" w:space="0" w:color="FFFFFF" w:themeColor="background1"/>
@@ -4955,7 +5006,7 @@
           <w:tcPr>
             <w:tcW w:w="2693" w:type="dxa"/>
             <w:tcBorders>
-              <w:top w:val="nil"/>
+              <w:top w:val="single" w:sz="4" w:space="0" w:color="FFFFFF"/>
               <w:left w:val="single" w:sz="8" w:space="0" w:color="FFFFFF" w:themeColor="background1"/>
               <w:bottom w:val="single" w:sz="4" w:space="0" w:color="BFBFBF"/>
               <w:right w:val="single" w:sz="8" w:space="0" w:color="FFFFFF" w:themeColor="background1"/>
@@ -4991,7 +5042,7 @@
           <w:tcPr>
             <w:tcW w:w="1134" w:type="dxa"/>
             <w:tcBorders>
-              <w:top w:val="nil"/>
+              <w:top w:val="single" w:sz="4" w:space="0" w:color="FFFFFF"/>
               <w:left w:val="single" w:sz="8" w:space="0" w:color="FFFFFF" w:themeColor="background1"/>
               <w:bottom w:val="single" w:sz="4" w:space="0" w:color="BFBFBF"/>
               <w:right w:val="single" w:sz="8" w:space="0" w:color="FFFFFF" w:themeColor="background1"/>
@@ -5273,14 +5324,14 @@
           <w:tcPr>
             <w:tcW w:w="1276" w:type="dxa"/>
             <w:tcBorders>
-              <w:top w:val="nil"/>
-              <w:left w:val="nil"/>
+              <w:top w:val="single" w:sz="4" w:space="0" w:color="FFFFFF"/>
+              <w:left w:val="single" w:sz="4" w:space="0" w:color="FFFFFF"/>
               <w:bottom w:val="single" w:sz="4" w:space="0" w:color="EB690B"/>
-              <w:right w:val="nil"/>
+              <w:right w:val="single" w:sz="4" w:space="0" w:color="FFFFFF"/>
             </w:tcBorders>
             <w:vAlign w:val="bottom"/>
           </w:tcPr>
-          <w:bookmarkStart w:id="4" w:name="_Hlk209008347"/>
+          <w:bookmarkStart w:id="5" w:name="_Hlk209008347"/>
           <w:p>
             <w:pPr>
               <w:spacing w:before="60" w:after="60"/>
@@ -6207,10 +6258,10 @@
           <w:tcPr>
             <w:tcW w:w="7371" w:type="dxa"/>
             <w:tcBorders>
-              <w:top w:val="nil"/>
-              <w:left w:val="nil"/>
+              <w:top w:val="single" w:sz="4" w:space="0" w:color="FFFFFF"/>
+              <w:left w:val="single" w:sz="4" w:space="0" w:color="FFFFFF"/>
               <w:bottom w:val="single" w:sz="4" w:space="0" w:color="EB690B"/>
-              <w:right w:val="nil"/>
+              <w:right w:val="single" w:sz="4" w:space="0" w:color="FFFFFF"/>
             </w:tcBorders>
             <w:vAlign w:val="center"/>
           </w:tcPr>
@@ -6246,7 +6297,7 @@
           </w:p>
         </w:tc>
       </w:tr>
-      <w:bookmarkEnd w:id="4"/>
+      <w:bookmarkEnd w:id="5"/>
     </w:tbl>
     <w:p>
       <w:pPr>
@@ -6283,10 +6334,10 @@
             <w:tcW w:w="8642" w:type="dxa"/>
             <w:gridSpan w:val="4"/>
             <w:tcBorders>
-              <w:top w:val="nil"/>
-              <w:left w:val="nil"/>
-              <w:bottom w:val="nil"/>
-              <w:right w:val="nil"/>
+              <w:top w:val="single" w:sz="4" w:space="0" w:color="FFFFFF"/>
+              <w:left w:val="single" w:sz="4" w:space="0" w:color="FFFFFF"/>
+              <w:bottom w:val="single" w:sz="4" w:space="0" w:color="FFFFFF"/>
+              <w:right w:val="single" w:sz="4" w:space="0" w:color="FFFFFF"/>
             </w:tcBorders>
           </w:tcPr>
           <w:p>
@@ -6330,7 +6381,7 @@
           <w:tcPr>
             <w:tcW w:w="2263" w:type="dxa"/>
             <w:tcBorders>
-              <w:top w:val="nil"/>
+              <w:top w:val="single" w:sz="4" w:space="0" w:color="FFFFFF"/>
               <w:left w:val="single" w:sz="8" w:space="0" w:color="FFFFFF" w:themeColor="background1"/>
               <w:bottom w:val="single" w:sz="4" w:space="0" w:color="BFBFBF"/>
               <w:right w:val="single" w:sz="8" w:space="0" w:color="FFFFFF" w:themeColor="background1"/>
@@ -6375,7 +6426,7 @@
           <w:tcPr>
             <w:tcW w:w="2552" w:type="dxa"/>
             <w:tcBorders>
-              <w:top w:val="nil"/>
+              <w:top w:val="single" w:sz="4" w:space="0" w:color="FFFFFF"/>
               <w:left w:val="single" w:sz="8" w:space="0" w:color="FFFFFF" w:themeColor="background1"/>
               <w:bottom w:val="single" w:sz="4" w:space="0" w:color="BFBFBF"/>
               <w:right w:val="single" w:sz="8" w:space="0" w:color="FFFFFF" w:themeColor="background1"/>
@@ -6411,7 +6462,7 @@
           <w:tcPr>
             <w:tcW w:w="2693" w:type="dxa"/>
             <w:tcBorders>
-              <w:top w:val="nil"/>
+              <w:top w:val="single" w:sz="4" w:space="0" w:color="FFFFFF"/>
               <w:left w:val="single" w:sz="8" w:space="0" w:color="FFFFFF" w:themeColor="background1"/>
               <w:bottom w:val="single" w:sz="4" w:space="0" w:color="BFBFBF"/>
               <w:right w:val="single" w:sz="8" w:space="0" w:color="FFFFFF" w:themeColor="background1"/>
@@ -6447,7 +6498,7 @@
           <w:tcPr>
             <w:tcW w:w="1134" w:type="dxa"/>
             <w:tcBorders>
-              <w:top w:val="nil"/>
+              <w:top w:val="single" w:sz="4" w:space="0" w:color="FFFFFF"/>
               <w:left w:val="single" w:sz="8" w:space="0" w:color="FFFFFF" w:themeColor="background1"/>
               <w:bottom w:val="single" w:sz="4" w:space="0" w:color="BFBFBF"/>
               <w:right w:val="single" w:sz="8" w:space="0" w:color="FFFFFF" w:themeColor="background1"/>
@@ -6721,10 +6772,10 @@
             <w:tcW w:w="8642" w:type="dxa"/>
             <w:gridSpan w:val="4"/>
             <w:tcBorders>
-              <w:top w:val="nil"/>
-              <w:left w:val="nil"/>
-              <w:bottom w:val="nil"/>
-              <w:right w:val="nil"/>
+              <w:top w:val="single" w:sz="4" w:space="0" w:color="FFFFFF"/>
+              <w:left w:val="single" w:sz="4" w:space="0" w:color="FFFFFF"/>
+              <w:bottom w:val="single" w:sz="4" w:space="0" w:color="FFFFFF"/>
+              <w:right w:val="single" w:sz="4" w:space="0" w:color="FFFFFF"/>
             </w:tcBorders>
           </w:tcPr>
           <w:p>
@@ -6758,27 +6809,7 @@
                 <w:color w:val="EB690B" w:themeColor="background2"/>
                 <w:szCs w:val="18"/>
               </w:rPr>
-              <w:t xml:space="preserve">(Dienstleistungsorientierung, Qualitätsbewusstsein, Wirtschaftliches Denken und Handeln, </w:t>
-            </w:r>
-            <w:proofErr w:type="spellStart"/>
-            <w:r>
-              <w:rPr>
-                <w:rFonts w:eastAsiaTheme="minorHAnsi"/>
-                <w:bCs/>
-                <w:color w:val="EB690B" w:themeColor="background2"/>
-                <w:szCs w:val="18"/>
-              </w:rPr>
-              <w:t>Mitarbeitendenförderung</w:t>
-            </w:r>
-            <w:proofErr w:type="spellEnd"/>
-            <w:r>
-              <w:rPr>
-                <w:rFonts w:eastAsiaTheme="minorHAnsi"/>
-                <w:bCs/>
-                <w:color w:val="EB690B" w:themeColor="background2"/>
-                <w:szCs w:val="18"/>
-              </w:rPr>
-              <w:t>)</w:t>
+              <w:t>(Dienstleistungsorientierung, Qualitätsbewusstsein, Wirtschaftliches Denken und Handeln, Mitarbeitendenförderung)</w:t>
             </w:r>
           </w:p>
         </w:tc>
@@ -6788,7 +6819,7 @@
           <w:tcPr>
             <w:tcW w:w="2263" w:type="dxa"/>
             <w:tcBorders>
-              <w:top w:val="nil"/>
+              <w:top w:val="single" w:sz="4" w:space="0" w:color="FFFFFF"/>
               <w:left w:val="single" w:sz="8" w:space="0" w:color="FFFFFF" w:themeColor="background1"/>
               <w:bottom w:val="single" w:sz="4" w:space="0" w:color="BFBFBF"/>
               <w:right w:val="single" w:sz="8" w:space="0" w:color="FFFFFF" w:themeColor="background1"/>
@@ -6833,7 +6864,7 @@
           <w:tcPr>
             <w:tcW w:w="2552" w:type="dxa"/>
             <w:tcBorders>
-              <w:top w:val="nil"/>
+              <w:top w:val="single" w:sz="4" w:space="0" w:color="FFFFFF"/>
               <w:left w:val="single" w:sz="8" w:space="0" w:color="FFFFFF" w:themeColor="background1"/>
               <w:bottom w:val="single" w:sz="4" w:space="0" w:color="BFBFBF"/>
               <w:right w:val="single" w:sz="8" w:space="0" w:color="FFFFFF" w:themeColor="background1"/>
@@ -6869,7 +6900,7 @@
           <w:tcPr>
             <w:tcW w:w="2693" w:type="dxa"/>
             <w:tcBorders>
-              <w:top w:val="nil"/>
+              <w:top w:val="single" w:sz="4" w:space="0" w:color="FFFFFF"/>
               <w:left w:val="single" w:sz="8" w:space="0" w:color="FFFFFF" w:themeColor="background1"/>
               <w:bottom w:val="single" w:sz="4" w:space="0" w:color="BFBFBF"/>
               <w:right w:val="single" w:sz="8" w:space="0" w:color="FFFFFF" w:themeColor="background1"/>
@@ -6905,7 +6936,7 @@
           <w:tcPr>
             <w:tcW w:w="1134" w:type="dxa"/>
             <w:tcBorders>
-              <w:top w:val="nil"/>
+              <w:top w:val="single" w:sz="4" w:space="0" w:color="FFFFFF"/>
               <w:left w:val="single" w:sz="8" w:space="0" w:color="FFFFFF" w:themeColor="background1"/>
               <w:bottom w:val="single" w:sz="4" w:space="0" w:color="BFBFBF"/>
               <w:right w:val="single" w:sz="8" w:space="0" w:color="FFFFFF" w:themeColor="background1"/>
@@ -7179,10 +7210,10 @@
             <w:tcW w:w="8642" w:type="dxa"/>
             <w:gridSpan w:val="4"/>
             <w:tcBorders>
-              <w:top w:val="nil"/>
-              <w:left w:val="nil"/>
-              <w:bottom w:val="nil"/>
-              <w:right w:val="nil"/>
+              <w:top w:val="single" w:sz="4" w:space="0" w:color="FFFFFF"/>
+              <w:left w:val="single" w:sz="4" w:space="0" w:color="FFFFFF"/>
+              <w:bottom w:val="single" w:sz="4" w:space="0" w:color="FFFFFF"/>
+              <w:right w:val="single" w:sz="4" w:space="0" w:color="FFFFFF"/>
             </w:tcBorders>
           </w:tcPr>
           <w:p>
@@ -7226,7 +7257,7 @@
           <w:tcPr>
             <w:tcW w:w="2263" w:type="dxa"/>
             <w:tcBorders>
-              <w:top w:val="nil"/>
+              <w:top w:val="single" w:sz="4" w:space="0" w:color="FFFFFF"/>
               <w:left w:val="single" w:sz="8" w:space="0" w:color="FFFFFF" w:themeColor="background1"/>
               <w:bottom w:val="single" w:sz="4" w:space="0" w:color="BFBFBF"/>
               <w:right w:val="single" w:sz="8" w:space="0" w:color="FFFFFF" w:themeColor="background1"/>
@@ -7271,7 +7302,7 @@
           <w:tcPr>
             <w:tcW w:w="2552" w:type="dxa"/>
             <w:tcBorders>
-              <w:top w:val="nil"/>
+              <w:top w:val="single" w:sz="4" w:space="0" w:color="FFFFFF"/>
               <w:left w:val="single" w:sz="8" w:space="0" w:color="FFFFFF" w:themeColor="background1"/>
               <w:bottom w:val="single" w:sz="4" w:space="0" w:color="BFBFBF"/>
               <w:right w:val="single" w:sz="8" w:space="0" w:color="FFFFFF" w:themeColor="background1"/>
@@ -7307,7 +7338,7 @@
           <w:tcPr>
             <w:tcW w:w="2693" w:type="dxa"/>
             <w:tcBorders>
-              <w:top w:val="nil"/>
+              <w:top w:val="single" w:sz="4" w:space="0" w:color="FFFFFF"/>
               <w:left w:val="single" w:sz="8" w:space="0" w:color="FFFFFF" w:themeColor="background1"/>
               <w:bottom w:val="single" w:sz="4" w:space="0" w:color="BFBFBF"/>
               <w:right w:val="single" w:sz="8" w:space="0" w:color="FFFFFF" w:themeColor="background1"/>
@@ -7343,7 +7374,7 @@
           <w:tcPr>
             <w:tcW w:w="1134" w:type="dxa"/>
             <w:tcBorders>
-              <w:top w:val="nil"/>
+              <w:top w:val="single" w:sz="4" w:space="0" w:color="FFFFFF"/>
               <w:left w:val="single" w:sz="8" w:space="0" w:color="FFFFFF" w:themeColor="background1"/>
               <w:bottom w:val="single" w:sz="4" w:space="0" w:color="BFBFBF"/>
               <w:right w:val="single" w:sz="8" w:space="0" w:color="FFFFFF" w:themeColor="background1"/>
@@ -7617,10 +7648,10 @@
             <w:tcW w:w="8642" w:type="dxa"/>
             <w:gridSpan w:val="4"/>
             <w:tcBorders>
-              <w:top w:val="nil"/>
-              <w:left w:val="nil"/>
-              <w:bottom w:val="nil"/>
-              <w:right w:val="nil"/>
+              <w:top w:val="single" w:sz="4" w:space="0" w:color="FFFFFF"/>
+              <w:left w:val="single" w:sz="4" w:space="0" w:color="FFFFFF"/>
+              <w:bottom w:val="single" w:sz="4" w:space="0" w:color="FFFFFF"/>
+              <w:right w:val="single" w:sz="4" w:space="0" w:color="FFFFFF"/>
             </w:tcBorders>
           </w:tcPr>
           <w:p>
@@ -7664,7 +7695,7 @@
           <w:tcPr>
             <w:tcW w:w="2263" w:type="dxa"/>
             <w:tcBorders>
-              <w:top w:val="nil"/>
+              <w:top w:val="single" w:sz="4" w:space="0" w:color="FFFFFF"/>
               <w:left w:val="single" w:sz="8" w:space="0" w:color="FFFFFF" w:themeColor="background1"/>
               <w:bottom w:val="single" w:sz="4" w:space="0" w:color="BFBFBF"/>
               <w:right w:val="single" w:sz="8" w:space="0" w:color="FFFFFF" w:themeColor="background1"/>
@@ -7709,7 +7740,7 @@
           <w:tcPr>
             <w:tcW w:w="2552" w:type="dxa"/>
             <w:tcBorders>
-              <w:top w:val="nil"/>
+              <w:top w:val="single" w:sz="4" w:space="0" w:color="FFFFFF"/>
               <w:left w:val="single" w:sz="8" w:space="0" w:color="FFFFFF" w:themeColor="background1"/>
               <w:bottom w:val="single" w:sz="4" w:space="0" w:color="BFBFBF"/>
               <w:right w:val="single" w:sz="8" w:space="0" w:color="FFFFFF" w:themeColor="background1"/>
@@ -7745,7 +7776,7 @@
           <w:tcPr>
             <w:tcW w:w="2693" w:type="dxa"/>
             <w:tcBorders>
-              <w:top w:val="nil"/>
+              <w:top w:val="single" w:sz="4" w:space="0" w:color="FFFFFF"/>
               <w:left w:val="single" w:sz="8" w:space="0" w:color="FFFFFF" w:themeColor="background1"/>
               <w:bottom w:val="single" w:sz="4" w:space="0" w:color="BFBFBF"/>
               <w:right w:val="single" w:sz="8" w:space="0" w:color="FFFFFF" w:themeColor="background1"/>
@@ -7781,7 +7812,7 @@
           <w:tcPr>
             <w:tcW w:w="1134" w:type="dxa"/>
             <w:tcBorders>
-              <w:top w:val="nil"/>
+              <w:top w:val="single" w:sz="4" w:space="0" w:color="FFFFFF"/>
               <w:left w:val="single" w:sz="8" w:space="0" w:color="FFFFFF" w:themeColor="background1"/>
               <w:bottom w:val="single" w:sz="4" w:space="0" w:color="BFBFBF"/>
               <w:right w:val="single" w:sz="8" w:space="0" w:color="FFFFFF" w:themeColor="background1"/>
@@ -8059,14 +8090,14 @@
           <w:tcPr>
             <w:tcW w:w="1276" w:type="dxa"/>
             <w:tcBorders>
-              <w:top w:val="nil"/>
-              <w:left w:val="nil"/>
+              <w:top w:val="single" w:sz="4" w:space="0" w:color="FFFFFF"/>
+              <w:left w:val="single" w:sz="4" w:space="0" w:color="FFFFFF"/>
               <w:bottom w:val="single" w:sz="4" w:space="0" w:color="2BC7A9"/>
-              <w:right w:val="nil"/>
+              <w:right w:val="single" w:sz="4" w:space="0" w:color="FFFFFF"/>
             </w:tcBorders>
             <w:vAlign w:val="bottom"/>
           </w:tcPr>
-          <w:bookmarkStart w:id="5" w:name="_Hlk209008363"/>
+          <w:bookmarkStart w:id="6" w:name="_Hlk209008363"/>
           <w:p>
             <w:pPr>
               <w:spacing w:before="60" w:after="60"/>
@@ -8135,10 +8166,10 @@
           <w:tcPr>
             <w:tcW w:w="7371" w:type="dxa"/>
             <w:tcBorders>
-              <w:top w:val="nil"/>
-              <w:left w:val="nil"/>
+              <w:top w:val="single" w:sz="4" w:space="0" w:color="FFFFFF"/>
+              <w:left w:val="single" w:sz="4" w:space="0" w:color="FFFFFF"/>
               <w:bottom w:val="single" w:sz="4" w:space="0" w:color="2BC7A9"/>
-              <w:right w:val="nil"/>
+              <w:right w:val="single" w:sz="4" w:space="0" w:color="FFFFFF"/>
             </w:tcBorders>
             <w:vAlign w:val="center"/>
           </w:tcPr>
@@ -8188,7 +8219,7 @@
           </w:p>
         </w:tc>
       </w:tr>
-      <w:bookmarkEnd w:id="5"/>
+      <w:bookmarkEnd w:id="6"/>
     </w:tbl>
     <w:p>
       <w:pPr>
@@ -8225,10 +8256,10 @@
             <w:tcW w:w="8642" w:type="dxa"/>
             <w:gridSpan w:val="4"/>
             <w:tcBorders>
-              <w:top w:val="nil"/>
-              <w:left w:val="nil"/>
-              <w:bottom w:val="nil"/>
-              <w:right w:val="nil"/>
+              <w:top w:val="single" w:sz="4" w:space="0" w:color="FFFFFF"/>
+              <w:left w:val="single" w:sz="4" w:space="0" w:color="FFFFFF"/>
+              <w:bottom w:val="single" w:sz="4" w:space="0" w:color="FFFFFF"/>
+              <w:right w:val="single" w:sz="4" w:space="0" w:color="FFFFFF"/>
             </w:tcBorders>
           </w:tcPr>
           <w:p>
@@ -8272,7 +8303,7 @@
           <w:tcPr>
             <w:tcW w:w="2263" w:type="dxa"/>
             <w:tcBorders>
-              <w:top w:val="nil"/>
+              <w:top w:val="single" w:sz="4" w:space="0" w:color="FFFFFF"/>
               <w:left w:val="single" w:sz="8" w:space="0" w:color="FFFFFF" w:themeColor="background1"/>
               <w:bottom w:val="single" w:sz="4" w:space="0" w:color="BFBFBF"/>
               <w:right w:val="single" w:sz="8" w:space="0" w:color="FFFFFF" w:themeColor="background1"/>
@@ -8317,7 +8348,7 @@
           <w:tcPr>
             <w:tcW w:w="2552" w:type="dxa"/>
             <w:tcBorders>
-              <w:top w:val="nil"/>
+              <w:top w:val="single" w:sz="4" w:space="0" w:color="FFFFFF"/>
               <w:left w:val="single" w:sz="8" w:space="0" w:color="FFFFFF" w:themeColor="background1"/>
               <w:bottom w:val="single" w:sz="4" w:space="0" w:color="BFBFBF"/>
               <w:right w:val="single" w:sz="8" w:space="0" w:color="FFFFFF" w:themeColor="background1"/>
@@ -8353,7 +8384,7 @@
           <w:tcPr>
             <w:tcW w:w="2693" w:type="dxa"/>
             <w:tcBorders>
-              <w:top w:val="nil"/>
+              <w:top w:val="single" w:sz="4" w:space="0" w:color="FFFFFF"/>
               <w:left w:val="single" w:sz="8" w:space="0" w:color="FFFFFF" w:themeColor="background1"/>
               <w:bottom w:val="single" w:sz="4" w:space="0" w:color="BFBFBF"/>
               <w:right w:val="single" w:sz="8" w:space="0" w:color="FFFFFF" w:themeColor="background1"/>
@@ -8389,7 +8420,7 @@
           <w:tcPr>
             <w:tcW w:w="1134" w:type="dxa"/>
             <w:tcBorders>
-              <w:top w:val="nil"/>
+              <w:top w:val="single" w:sz="4" w:space="0" w:color="FFFFFF"/>
               <w:left w:val="single" w:sz="8" w:space="0" w:color="FFFFFF" w:themeColor="background1"/>
               <w:bottom w:val="single" w:sz="4" w:space="0" w:color="BFBFBF"/>
               <w:right w:val="single" w:sz="8" w:space="0" w:color="FFFFFF" w:themeColor="background1"/>
@@ -8663,10 +8694,10 @@
             <w:tcW w:w="8642" w:type="dxa"/>
             <w:gridSpan w:val="4"/>
             <w:tcBorders>
-              <w:top w:val="nil"/>
-              <w:left w:val="nil"/>
-              <w:bottom w:val="nil"/>
-              <w:right w:val="nil"/>
+              <w:top w:val="single" w:sz="4" w:space="0" w:color="FFFFFF"/>
+              <w:left w:val="single" w:sz="4" w:space="0" w:color="FFFFFF"/>
+              <w:bottom w:val="single" w:sz="4" w:space="0" w:color="FFFFFF"/>
+              <w:right w:val="single" w:sz="4" w:space="0" w:color="FFFFFF"/>
             </w:tcBorders>
           </w:tcPr>
           <w:p>
@@ -8710,7 +8741,7 @@
           <w:tcPr>
             <w:tcW w:w="2263" w:type="dxa"/>
             <w:tcBorders>
-              <w:top w:val="nil"/>
+              <w:top w:val="single" w:sz="4" w:space="0" w:color="FFFFFF"/>
               <w:left w:val="single" w:sz="8" w:space="0" w:color="FFFFFF" w:themeColor="background1"/>
               <w:bottom w:val="single" w:sz="4" w:space="0" w:color="BFBFBF"/>
               <w:right w:val="single" w:sz="8" w:space="0" w:color="FFFFFF" w:themeColor="background1"/>
@@ -8755,7 +8786,7 @@
           <w:tcPr>
             <w:tcW w:w="2552" w:type="dxa"/>
             <w:tcBorders>
-              <w:top w:val="nil"/>
+              <w:top w:val="single" w:sz="4" w:space="0" w:color="FFFFFF"/>
               <w:left w:val="single" w:sz="8" w:space="0" w:color="FFFFFF" w:themeColor="background1"/>
               <w:bottom w:val="single" w:sz="4" w:space="0" w:color="BFBFBF"/>
               <w:right w:val="single" w:sz="8" w:space="0" w:color="FFFFFF" w:themeColor="background1"/>
@@ -8791,7 +8822,7 @@
           <w:tcPr>
             <w:tcW w:w="2693" w:type="dxa"/>
             <w:tcBorders>
-              <w:top w:val="nil"/>
+              <w:top w:val="single" w:sz="4" w:space="0" w:color="FFFFFF"/>
               <w:left w:val="single" w:sz="8" w:space="0" w:color="FFFFFF" w:themeColor="background1"/>
               <w:bottom w:val="single" w:sz="4" w:space="0" w:color="BFBFBF"/>
               <w:right w:val="single" w:sz="8" w:space="0" w:color="FFFFFF" w:themeColor="background1"/>
@@ -8827,7 +8858,7 @@
           <w:tcPr>
             <w:tcW w:w="1134" w:type="dxa"/>
             <w:tcBorders>
-              <w:top w:val="nil"/>
+              <w:top w:val="single" w:sz="4" w:space="0" w:color="FFFFFF"/>
               <w:left w:val="single" w:sz="8" w:space="0" w:color="FFFFFF" w:themeColor="background1"/>
               <w:bottom w:val="single" w:sz="4" w:space="0" w:color="BFBFBF"/>
               <w:right w:val="single" w:sz="8" w:space="0" w:color="FFFFFF" w:themeColor="background1"/>
@@ -9101,10 +9132,10 @@
             <w:tcW w:w="8642" w:type="dxa"/>
             <w:gridSpan w:val="4"/>
             <w:tcBorders>
-              <w:top w:val="nil"/>
-              <w:left w:val="nil"/>
-              <w:bottom w:val="nil"/>
-              <w:right w:val="nil"/>
+              <w:top w:val="single" w:sz="4" w:space="0" w:color="FFFFFF"/>
+              <w:left w:val="single" w:sz="4" w:space="0" w:color="FFFFFF"/>
+              <w:bottom w:val="single" w:sz="4" w:space="0" w:color="FFFFFF"/>
+              <w:right w:val="single" w:sz="4" w:space="0" w:color="FFFFFF"/>
             </w:tcBorders>
           </w:tcPr>
           <w:p>
@@ -9148,7 +9179,7 @@
           <w:tcPr>
             <w:tcW w:w="2263" w:type="dxa"/>
             <w:tcBorders>
-              <w:top w:val="nil"/>
+              <w:top w:val="single" w:sz="4" w:space="0" w:color="FFFFFF"/>
               <w:left w:val="single" w:sz="8" w:space="0" w:color="FFFFFF" w:themeColor="background1"/>
               <w:bottom w:val="single" w:sz="4" w:space="0" w:color="BFBFBF"/>
               <w:right w:val="single" w:sz="8" w:space="0" w:color="FFFFFF" w:themeColor="background1"/>
@@ -9193,7 +9224,7 @@
           <w:tcPr>
             <w:tcW w:w="2552" w:type="dxa"/>
             <w:tcBorders>
-              <w:top w:val="nil"/>
+              <w:top w:val="single" w:sz="4" w:space="0" w:color="FFFFFF"/>
               <w:left w:val="single" w:sz="8" w:space="0" w:color="FFFFFF" w:themeColor="background1"/>
               <w:bottom w:val="single" w:sz="4" w:space="0" w:color="BFBFBF"/>
               <w:right w:val="single" w:sz="8" w:space="0" w:color="FFFFFF" w:themeColor="background1"/>
@@ -9229,7 +9260,7 @@
           <w:tcPr>
             <w:tcW w:w="2693" w:type="dxa"/>
             <w:tcBorders>
-              <w:top w:val="nil"/>
+              <w:top w:val="single" w:sz="4" w:space="0" w:color="FFFFFF"/>
               <w:left w:val="single" w:sz="8" w:space="0" w:color="FFFFFF" w:themeColor="background1"/>
               <w:bottom w:val="single" w:sz="4" w:space="0" w:color="BFBFBF"/>
               <w:right w:val="single" w:sz="8" w:space="0" w:color="FFFFFF" w:themeColor="background1"/>
@@ -9265,7 +9296,7 @@
           <w:tcPr>
             <w:tcW w:w="1134" w:type="dxa"/>
             <w:tcBorders>
-              <w:top w:val="nil"/>
+              <w:top w:val="single" w:sz="4" w:space="0" w:color="FFFFFF"/>
               <w:left w:val="single" w:sz="8" w:space="0" w:color="FFFFFF" w:themeColor="background1"/>
               <w:bottom w:val="single" w:sz="4" w:space="0" w:color="BFBFBF"/>
               <w:right w:val="single" w:sz="8" w:space="0" w:color="FFFFFF" w:themeColor="background1"/>
@@ -9558,12 +9589,10 @@
       <w:tblPr>
         <w:tblW w:w="8647" w:type="dxa"/>
         <w:tblBorders>
-          <w:top w:val="single" w:sz="4" w:space="0" w:color="A6A6A6" w:themeColor="background1" w:themeShade="A6"/>
-          <w:left w:val="single" w:sz="4" w:space="0" w:color="A6A6A6" w:themeColor="background1" w:themeShade="A6"/>
-          <w:bottom w:val="single" w:sz="4" w:space="0" w:color="A6A6A6" w:themeColor="background1" w:themeShade="A6"/>
-          <w:right w:val="single" w:sz="4" w:space="0" w:color="A6A6A6" w:themeColor="background1" w:themeShade="A6"/>
-          <w:insideH w:val="single" w:sz="4" w:space="0" w:color="A6A6A6" w:themeColor="background1" w:themeShade="A6"/>
-          <w:insideV w:val="single" w:sz="4" w:space="0" w:color="A6A6A6" w:themeColor="background1" w:themeShade="A6"/>
+          <w:top w:val="single" w:sz="4" w:space="0" w:color="FFFFFF"/>
+          <w:left w:val="single" w:sz="4" w:space="0" w:color="FFFFFF"/>
+          <w:bottom w:val="single" w:sz="4" w:space="0" w:color="FFFFFF"/>
+          <w:right w:val="single" w:sz="4" w:space="0" w:color="FFFFFF"/>
         </w:tblBorders>
         <w:shd w:val="clear" w:color="auto" w:fill="FCE0CC" w:themeFill="background2" w:themeFillTint="33"/>
         <w:tblLook w:val="01E0" w:firstRow="1" w:lastRow="1" w:firstColumn="1" w:lastColumn="1" w:noHBand="0" w:noVBand="0"/>
@@ -9578,12 +9607,6 @@
         <w:tc>
           <w:tcPr>
             <w:tcW w:w="8647" w:type="dxa"/>
-            <w:tcBorders>
-              <w:top w:val="nil"/>
-              <w:left w:val="nil"/>
-              <w:bottom w:val="nil"/>
-              <w:right w:val="nil"/>
-            </w:tcBorders>
             <w:shd w:val="clear" w:color="auto" w:fill="FCE0CC" w:themeFill="background2" w:themeFillTint="33"/>
             <w:vAlign w:val="center"/>
           </w:tcPr>
@@ -9601,7 +9624,28 @@
                 <w:sz w:val="16"/>
                 <w:szCs w:val="16"/>
               </w:rPr>
-              <w:t>Die laufbahnorientierte Entwicklung (nächsthöhere Funktion, vertikale Laufbahn, Übernahme Stellvertretung, usw.) findet im Rahmen der Nachfolge- und Entwicklungsplanung (NEP) statt.</w:t>
+              <w:t>Die laufbahnorientierte Entwicklung (nächsthöhere Funktion, vertikale Laufbahn,</w:t>
+            </w:r>
+            <w:r>
+              <w:rPr>
+                <w:sz w:val="16"/>
+                <w:szCs w:val="16"/>
+              </w:rPr>
+              <w:t xml:space="preserve"> KNF I &amp; II,</w:t>
+            </w:r>
+            <w:r>
+              <w:rPr>
+                <w:sz w:val="16"/>
+                <w:szCs w:val="16"/>
+              </w:rPr>
+              <w:t xml:space="preserve"> Übernahme Stellvertretung, usw.) findet im Rahmen der Nachfolge- und Entwicklungsplanung (NEP) statt.</w:t>
+            </w:r>
+            <w:r>
+              <w:rPr>
+                <w:sz w:val="16"/>
+                <w:szCs w:val="16"/>
+              </w:rPr>
+              <w:t xml:space="preserve"> </w:t>
             </w:r>
           </w:p>
         </w:tc>
@@ -9649,6 +9693,9 @@
           <w:tcPr>
             <w:tcW w:w="6804" w:type="dxa"/>
             <w:tcBorders>
+              <w:top w:val="single" w:sz="4" w:space="0" w:color="FFFFFF"/>
+              <w:left w:val="single" w:sz="4" w:space="0" w:color="FFFFFF"/>
+              <w:bottom w:val="single" w:sz="4" w:space="0" w:color="FFFFFF"/>
               <w:right w:val="single" w:sz="4" w:space="0" w:color="BFBFBF" w:themeColor="background1" w:themeShade="BF"/>
             </w:tcBorders>
             <w:shd w:val="clear" w:color="auto" w:fill="FFFFFF" w:themeFill="background1"/>
@@ -9768,7 +9815,10 @@
           <w:tcPr>
             <w:tcW w:w="8647" w:type="dxa"/>
             <w:tcBorders>
+              <w:top w:val="single" w:sz="4" w:space="0" w:color="FFFFFF"/>
+              <w:left w:val="single" w:sz="4" w:space="0" w:color="FFFFFF"/>
               <w:bottom w:val="single" w:sz="4" w:space="0" w:color="BFBFBF" w:themeColor="background1" w:themeShade="BF"/>
+              <w:right w:val="single" w:sz="4" w:space="0" w:color="FFFFFF"/>
             </w:tcBorders>
           </w:tcPr>
           <w:p>
@@ -9917,6 +9967,12 @@
         <w:tc>
           <w:tcPr>
             <w:tcW w:w="7513" w:type="dxa"/>
+            <w:tcBorders>
+              <w:top w:val="single" w:sz="4" w:space="0" w:color="FFFFFF"/>
+              <w:left w:val="single" w:sz="4" w:space="0" w:color="FFFFFF"/>
+              <w:bottom w:val="single" w:sz="4" w:space="0" w:color="FFFFFF"/>
+              <w:right w:val="single" w:sz="4" w:space="0" w:color="FFFFFF"/>
+            </w:tcBorders>
             <w:shd w:val="clear" w:color="auto" w:fill="FCE0CC" w:themeFill="background2" w:themeFillTint="33"/>
             <w:vAlign w:val="center"/>
           </w:tcPr>
@@ -10107,6 +10163,12 @@
         <w:tc>
           <w:tcPr>
             <w:tcW w:w="1134" w:type="dxa"/>
+            <w:tcBorders>
+              <w:top w:val="single" w:sz="4" w:space="0" w:color="FFFFFF"/>
+              <w:left w:val="single" w:sz="4" w:space="0" w:color="FFFFFF"/>
+              <w:bottom w:val="single" w:sz="4" w:space="0" w:color="FFFFFF"/>
+              <w:right w:val="single" w:sz="4" w:space="0" w:color="FFFFFF"/>
+            </w:tcBorders>
             <w:shd w:val="clear" w:color="auto" w:fill="FCE0CC" w:themeFill="background2" w:themeFillTint="33"/>
             <w:vAlign w:val="center"/>
           </w:tcPr>
@@ -10123,7 +10185,7 @@
                 <w:noProof/>
               </w:rPr>
               <w:drawing>
-                <wp:anchor distT="0" distB="0" distL="114300" distR="114300" simplePos="0" relativeHeight="251660291" behindDoc="0" locked="0" layoutInCell="1" allowOverlap="1" wp14:anchorId="72485827" wp14:editId="2935C5B5">
+                <wp:anchor distT="0" distB="0" distL="114300" distR="114300" simplePos="0" relativeHeight="251660291" behindDoc="0" locked="0" layoutInCell="1" allowOverlap="1" wp14:anchorId="72485827" wp14:editId="7B28EE29">
                   <wp:simplePos x="0" y="0"/>
                   <wp:positionH relativeFrom="column">
                     <wp:posOffset>131445</wp:posOffset>
@@ -10234,9 +10296,9 @@
           <w:tcPr>
             <w:tcW w:w="851" w:type="dxa"/>
             <w:tcBorders>
-              <w:top w:val="nil"/>
-              <w:left w:val="nil"/>
-              <w:bottom w:val="nil"/>
+              <w:top w:val="single" w:sz="4" w:space="0" w:color="FFFFFF"/>
+              <w:left w:val="single" w:sz="4" w:space="0" w:color="FFFFFF"/>
+              <w:bottom w:val="single" w:sz="4" w:space="0" w:color="FFFFFF"/>
               <w:right w:val="single" w:sz="4" w:space="0" w:color="BFBFBF" w:themeColor="background1" w:themeShade="BF"/>
             </w:tcBorders>
           </w:tcPr>
@@ -10311,10 +10373,10 @@
           <w:tcPr>
             <w:tcW w:w="1559" w:type="dxa"/>
             <w:tcBorders>
-              <w:top w:val="nil"/>
+              <w:top w:val="single" w:sz="4" w:space="0" w:color="FFFFFF"/>
               <w:left w:val="single" w:sz="4" w:space="0" w:color="BFBFBF"/>
-              <w:bottom w:val="nil"/>
-              <w:right w:val="nil"/>
+              <w:bottom w:val="single" w:sz="4" w:space="0" w:color="FFFFFF"/>
+              <w:right w:val="single" w:sz="4" w:space="0" w:color="FFFFFF"/>
             </w:tcBorders>
           </w:tcPr>
           <w:p>
@@ -10331,10 +10393,10 @@
           <w:tcPr>
             <w:tcW w:w="567" w:type="dxa"/>
             <w:tcBorders>
-              <w:top w:val="nil"/>
-              <w:left w:val="nil"/>
-              <w:bottom w:val="nil"/>
-              <w:right w:val="nil"/>
+              <w:top w:val="single" w:sz="4" w:space="0" w:color="FFFFFF"/>
+              <w:left w:val="single" w:sz="4" w:space="0" w:color="FFFFFF"/>
+              <w:bottom w:val="single" w:sz="4" w:space="0" w:color="FFFFFF"/>
+              <w:right w:val="single" w:sz="4" w:space="0" w:color="FFFFFF"/>
             </w:tcBorders>
           </w:tcPr>
           <w:p>
@@ -10351,9 +10413,9 @@
           <w:tcPr>
             <w:tcW w:w="851" w:type="dxa"/>
             <w:tcBorders>
-              <w:top w:val="nil"/>
-              <w:left w:val="nil"/>
-              <w:bottom w:val="nil"/>
+              <w:top w:val="single" w:sz="4" w:space="0" w:color="FFFFFF"/>
+              <w:left w:val="single" w:sz="4" w:space="0" w:color="FFFFFF"/>
+              <w:bottom w:val="single" w:sz="4" w:space="0" w:color="FFFFFF"/>
               <w:right w:val="single" w:sz="4" w:space="0" w:color="BFBFBF"/>
             </w:tcBorders>
           </w:tcPr>
@@ -10428,10 +10490,10 @@
           <w:tcPr>
             <w:tcW w:w="1379" w:type="dxa"/>
             <w:tcBorders>
-              <w:top w:val="nil"/>
+              <w:top w:val="single" w:sz="4" w:space="0" w:color="FFFFFF"/>
               <w:left w:val="single" w:sz="4" w:space="0" w:color="BFBFBF"/>
-              <w:bottom w:val="nil"/>
-              <w:right w:val="nil"/>
+              <w:bottom w:val="single" w:sz="4" w:space="0" w:color="FFFFFF"/>
+              <w:right w:val="single" w:sz="4" w:space="0" w:color="FFFFFF"/>
             </w:tcBorders>
           </w:tcPr>
           <w:p>
@@ -10455,9 +10517,9 @@
             <w:gridSpan w:val="3"/>
             <w:tcBorders>
               <w:top w:val="nil"/>
-              <w:left w:val="nil"/>
+              <w:left w:val="single" w:sz="4" w:space="0" w:color="FFFFFF"/>
               <w:bottom w:val="single" w:sz="4" w:space="0" w:color="BFBFBF"/>
-              <w:right w:val="nil"/>
+              <w:right w:val="single" w:sz="4" w:space="0" w:color="FFFFFF"/>
             </w:tcBorders>
           </w:tcPr>
           <w:p>
@@ -10474,10 +10536,10 @@
           <w:tcPr>
             <w:tcW w:w="567" w:type="dxa"/>
             <w:tcBorders>
-              <w:top w:val="nil"/>
-              <w:left w:val="nil"/>
-              <w:bottom w:val="nil"/>
-              <w:right w:val="nil"/>
+              <w:top w:val="single" w:sz="4" w:space="0" w:color="FFFFFF"/>
+              <w:left w:val="single" w:sz="4" w:space="0" w:color="FFFFFF"/>
+              <w:bottom w:val="single" w:sz="4" w:space="0" w:color="FFFFFF"/>
+              <w:right w:val="single" w:sz="4" w:space="0" w:color="FFFFFF"/>
             </w:tcBorders>
           </w:tcPr>
           <w:p>
@@ -10496,9 +10558,9 @@
             <w:gridSpan w:val="3"/>
             <w:tcBorders>
               <w:top w:val="nil"/>
-              <w:left w:val="nil"/>
+              <w:left w:val="single" w:sz="4" w:space="0" w:color="FFFFFF"/>
               <w:bottom w:val="single" w:sz="4" w:space="0" w:color="BFBFBF"/>
-              <w:right w:val="nil"/>
+              <w:right w:val="single" w:sz="4" w:space="0" w:color="FFFFFF"/>
             </w:tcBorders>
           </w:tcPr>
           <w:p>
@@ -10542,10 +10604,10 @@
           <w:tcPr>
             <w:tcW w:w="567" w:type="dxa"/>
             <w:tcBorders>
-              <w:top w:val="nil"/>
+              <w:top w:val="single" w:sz="4" w:space="0" w:color="FFFFFF"/>
               <w:left w:val="single" w:sz="4" w:space="0" w:color="BFBFBF"/>
-              <w:bottom w:val="nil"/>
-              <w:right w:val="single" w:sz="4" w:space="0" w:color="BFBFBF"/>
+              <w:bottom w:val="single" w:sz="4" w:space="0" w:color="FFFFFF"/>
+              <w:right w:val="single" w:sz="4" w:space="0" w:color="BFBFBF" w:themeColor="background1" w:themeShade="BF"/>
             </w:tcBorders>
           </w:tcPr>
           <w:p>
@@ -10564,7 +10626,7 @@
             <w:gridSpan w:val="3"/>
             <w:tcBorders>
               <w:top w:val="single" w:sz="4" w:space="0" w:color="BFBFBF"/>
-              <w:left w:val="single" w:sz="4" w:space="0" w:color="BFBFBF"/>
+              <w:left w:val="single" w:sz="4" w:space="0" w:color="BFBFBF" w:themeColor="background1" w:themeShade="BF"/>
               <w:bottom w:val="single" w:sz="4" w:space="0" w:color="BFBFBF" w:themeColor="background1" w:themeShade="BF"/>
               <w:right w:val="single" w:sz="4" w:space="0" w:color="BFBFBF" w:themeColor="background1" w:themeShade="BF"/>
             </w:tcBorders>
@@ -10591,9 +10653,9 @@
             <w:gridSpan w:val="4"/>
             <w:tcBorders>
               <w:top w:val="nil"/>
-              <w:left w:val="nil"/>
-              <w:bottom w:val="nil"/>
-              <w:right w:val="nil"/>
+              <w:left w:val="single" w:sz="4" w:space="0" w:color="FFFFFF"/>
+              <w:bottom w:val="single" w:sz="4" w:space="0" w:color="FFFFFF"/>
+              <w:right w:val="single" w:sz="4" w:space="0" w:color="FFFFFF"/>
             </w:tcBorders>
             <w:vAlign w:val="center"/>
           </w:tcPr>
@@ -10625,9 +10687,9 @@
             <w:gridSpan w:val="3"/>
             <w:tcBorders>
               <w:top w:val="single" w:sz="4" w:space="0" w:color="BFBFBF" w:themeColor="background1" w:themeShade="BF"/>
-              <w:left w:val="nil"/>
-              <w:bottom w:val="nil"/>
-              <w:right w:val="nil"/>
+              <w:left w:val="single" w:sz="4" w:space="0" w:color="FFFFFF"/>
+              <w:bottom w:val="single" w:sz="4" w:space="0" w:color="FFFFFF" w:themeColor="background1"/>
+              <w:right w:val="single" w:sz="4" w:space="0" w:color="FFFFFF"/>
             </w:tcBorders>
             <w:vAlign w:val="center"/>
           </w:tcPr>
@@ -10723,6 +10785,12 @@
     <w:tbl>
       <w:tblPr>
         <w:tblW w:w="8647" w:type="dxa"/>
+        <w:tblBorders>
+          <w:top w:val="single" w:sz="4" w:space="0" w:color="FFFFFF" w:themeColor="background1"/>
+          <w:left w:val="single" w:sz="4" w:space="0" w:color="FFFFFF" w:themeColor="background1"/>
+          <w:bottom w:val="single" w:sz="4" w:space="0" w:color="FFFFFF" w:themeColor="background1"/>
+          <w:right w:val="single" w:sz="4" w:space="0" w:color="FFFFFF" w:themeColor="background1"/>
+        </w:tblBorders>
         <w:shd w:val="clear" w:color="auto" w:fill="FCE0CC" w:themeFill="background2" w:themeFillTint="33"/>
         <w:tblLook w:val="01E0" w:firstRow="1" w:lastRow="1" w:firstColumn="1" w:lastColumn="1" w:noHBand="0" w:noVBand="0"/>
       </w:tblPr>
@@ -10962,7 +11030,7 @@
           <w:szCs w:val="18"/>
         </w:rPr>
       </w:pPr>
-      <w:bookmarkStart w:id="6" w:name="_Hlk177453926"/>
+      <w:bookmarkStart w:id="7" w:name="_Hlk177453926"/>
       <w:r>
         <w:rPr>
           <w:sz w:val="16"/>
@@ -10996,21 +11064,14 @@
           <w:sz w:val="16"/>
           <w:szCs w:val="16"/>
         </w:rPr>
-        <w:t xml:space="preserve">Das </w:t>
+        <w:t xml:space="preserve">Human Resources &amp; Entwicklung </w:t>
       </w:r>
       <w:r>
         <w:rPr>
           <w:sz w:val="16"/>
           <w:szCs w:val="16"/>
         </w:rPr>
-        <w:t>HR-Management</w:t>
-      </w:r>
-      <w:r>
-        <w:rPr>
-          <w:sz w:val="16"/>
-          <w:szCs w:val="16"/>
-        </w:rPr>
-        <w:t xml:space="preserve"> liest den </w:t>
+        <w:t xml:space="preserve">liest den </w:t>
       </w:r>
       <w:r>
         <w:rPr>
@@ -11026,7 +11087,7 @@
         </w:rPr>
         <w:t xml:space="preserve"> grundsätzlich nicht</w:t>
       </w:r>
-      <w:bookmarkEnd w:id="6"/>
+      <w:bookmarkEnd w:id="7"/>
       <w:r>
         <w:rPr>
           <w:sz w:val="16"/>
@@ -11236,6 +11297,9 @@
                             <w:tc>
                               <w:tcPr>
                                 <w:tcW w:w="3043" w:type="dxa"/>
+                                <w:tcBorders>
+                                  <w:right w:val="single" w:sz="4" w:space="0" w:color="FFFFFF"/>
+                                </w:tcBorders>
                                 <w:vAlign w:val="center"/>
                                 <w:hideMark/>
                               </w:tcPr>
@@ -11342,6 +11406,9 @@
                       <w:tc>
                         <w:tcPr>
                           <w:tcW w:w="3043" w:type="dxa"/>
+                          <w:tcBorders>
+                            <w:right w:val="single" w:sz="4" w:space="0" w:color="FFFFFF"/>
+                          </w:tcBorders>
                           <w:vAlign w:val="center"/>
                           <w:hideMark/>
                         </w:tcPr>
@@ -11643,7 +11710,7 @@
                                   <pic:cNvPicPr/>
                                 </pic:nvPicPr>
                                 <pic:blipFill>
-                                  <a:blip r:embed="rId1"/>
+                                  <a:blip r:embed="rId2"/>
                                   <a:stretch>
                                     <a:fillRect/>
                                   </a:stretch>
@@ -11923,6 +11990,9 @@
                                 <w:tc>
                                   <w:tcPr>
                                     <w:tcW w:w="8505" w:type="dxa"/>
+                                    <w:tcBorders>
+                                      <w:bottom w:val="single" w:sz="4" w:space="0" w:color="FFFFFF"/>
+                                    </w:tcBorders>
                                     <w:vAlign w:val="bottom"/>
                                   </w:tcPr>
                                   <w:p>
@@ -11959,6 +12029,10 @@
                                 <w:tc>
                                   <w:tcPr>
                                     <w:tcW w:w="8505" w:type="dxa"/>
+                                    <w:tcBorders>
+                                      <w:top w:val="single" w:sz="4" w:space="0" w:color="FFFFFF"/>
+                                      <w:bottom w:val="single" w:sz="4" w:space="0" w:color="FFFFFF"/>
+                                    </w:tcBorders>
                                   </w:tcPr>
                                   <w:p>
                                     <w:pPr>
@@ -11979,6 +12053,9 @@
                             <w:tc>
                               <w:tcPr>
                                 <w:tcW w:w="8505" w:type="dxa"/>
+                                <w:tcBorders>
+                                  <w:top w:val="single" w:sz="4" w:space="0" w:color="FFFFFF"/>
+                                </w:tcBorders>
                               </w:tcPr>
                               <w:p>
                                 <w:pPr>
@@ -12092,6 +12169,9 @@
                           <w:tc>
                             <w:tcPr>
                               <w:tcW w:w="8505" w:type="dxa"/>
+                              <w:tcBorders>
+                                <w:bottom w:val="single" w:sz="4" w:space="0" w:color="FFFFFF"/>
+                              </w:tcBorders>
                               <w:vAlign w:val="bottom"/>
                             </w:tcPr>
                             <w:p>
@@ -12128,6 +12208,10 @@
                           <w:tc>
                             <w:tcPr>
                               <w:tcW w:w="8505" w:type="dxa"/>
+                              <w:tcBorders>
+                                <w:top w:val="single" w:sz="4" w:space="0" w:color="FFFFFF"/>
+                                <w:bottom w:val="single" w:sz="4" w:space="0" w:color="FFFFFF"/>
+                              </w:tcBorders>
                             </w:tcPr>
                             <w:p>
                               <w:pPr>
@@ -12148,6 +12232,9 @@
                       <w:tc>
                         <w:tcPr>
                           <w:tcW w:w="8505" w:type="dxa"/>
+                          <w:tcBorders>
+                            <w:top w:val="single" w:sz="4" w:space="0" w:color="FFFFFF"/>
+                          </w:tcBorders>
                         </w:tcPr>
                         <w:p>
                           <w:pPr>
@@ -12855,7 +12942,7 @@
                                   <pic:cNvPicPr/>
                                 </pic:nvPicPr>
                                 <pic:blipFill>
-                                  <a:blip r:embed="rId1"/>
+                                  <a:blip r:embed="rId2"/>
                                   <a:stretch>
                                     <a:fillRect/>
                                   </a:stretch>
@@ -17886,6 +17973,7 @@
   <w:style w:type="character" w:default="1" w:styleId="Absatz-Standardschriftart">
     <w:name w:val="Default Paragraph Font"/>
     <w:uiPriority w:val="1"/>
+    <w:semiHidden/>
     <w:unhideWhenUsed/>
   </w:style>
   <w:style w:type="table" w:default="1" w:styleId="NormaleTabelle">
@@ -19599,7 +19687,7 @@
       <w:docPartBody>
         <w:p>
           <w:pPr>
-            <w:pStyle w:val="E9D4F7F513954294A3670564F5CB9112"/>
+            <w:pStyle w:val="E9D4F7F513954294A3670564F5CB91121"/>
           </w:pPr>
           <w:r>
             <w:rPr>
@@ -19628,7 +19716,7 @@
       <w:docPartBody>
         <w:p>
           <w:pPr>
-            <w:pStyle w:val="BE90003F78C34049A3BA1AF6E6CEA736"/>
+            <w:pStyle w:val="BE90003F78C34049A3BA1AF6E6CEA7361"/>
           </w:pPr>
           <w:r>
             <w:rPr>
@@ -19657,7 +19745,7 @@
       <w:docPartBody>
         <w:p>
           <w:pPr>
-            <w:pStyle w:val="1AB9CE3D21E547558004894C440DD168"/>
+            <w:pStyle w:val="1AB9CE3D21E547558004894C440DD1681"/>
           </w:pPr>
           <w:r>
             <w:rPr>
@@ -19686,7 +19774,7 @@
       <w:docPartBody>
         <w:p>
           <w:pPr>
-            <w:pStyle w:val="99E0EB8EE80A41A6A50A825E9DA2E490"/>
+            <w:pStyle w:val="99E0EB8EE80A41A6A50A825E9DA2E4901"/>
           </w:pPr>
           <w:r>
             <w:rPr>
@@ -19715,7 +19803,7 @@
       <w:docPartBody>
         <w:p>
           <w:pPr>
-            <w:pStyle w:val="111AEDFC5D75484CA775D522AEA659BD"/>
+            <w:pStyle w:val="111AEDFC5D75484CA775D522AEA659BD1"/>
           </w:pPr>
           <w:r>
             <w:rPr>
@@ -19744,7 +19832,7 @@
       <w:docPartBody>
         <w:p>
           <w:pPr>
-            <w:pStyle w:val="2FAF77FB34F549B3B5DDACE630C75F40"/>
+            <w:pStyle w:val="2FAF77FB34F549B3B5DDACE630C75F401"/>
           </w:pPr>
           <w:r>
             <w:rPr>
@@ -19773,7 +19861,7 @@
       <w:docPartBody>
         <w:p>
           <w:pPr>
-            <w:pStyle w:val="13D9264CC9164A9E976948BC93968586"/>
+            <w:pStyle w:val="13D9264CC9164A9E976948BC939685861"/>
           </w:pPr>
           <w:r>
             <w:rPr>
@@ -19803,7 +19891,7 @@
       <w:docPartBody>
         <w:p>
           <w:pPr>
-            <w:pStyle w:val="59340B5617DA409CBA885BD72E32B920"/>
+            <w:pStyle w:val="59340B5617DA409CBA885BD72E32B9201"/>
           </w:pPr>
           <w:r>
             <w:rPr>
@@ -19833,7 +19921,7 @@
       <w:docPartBody>
         <w:p>
           <w:pPr>
-            <w:pStyle w:val="5D563D3C40324C75986540AB8D886152"/>
+            <w:pStyle w:val="5D563D3C40324C75986540AB8D8861521"/>
           </w:pPr>
           <w:r>
             <w:rPr>
@@ -19863,7 +19951,7 @@
       <w:docPartBody>
         <w:p>
           <w:pPr>
-            <w:pStyle w:val="4E92C4B1DE3F48E79E8F1C3488E31A37"/>
+            <w:pStyle w:val="4E92C4B1DE3F48E79E8F1C3488E31A371"/>
           </w:pPr>
           <w:r>
             <w:rPr>
@@ -19892,7 +19980,7 @@
       <w:docPartBody>
         <w:p>
           <w:pPr>
-            <w:pStyle w:val="51C850EA2880437780F2D264505AB36A"/>
+            <w:pStyle w:val="51C850EA2880437780F2D264505AB36A1"/>
           </w:pPr>
           <w:r>
             <w:rPr>
@@ -19921,7 +20009,7 @@
       <w:docPartBody>
         <w:p>
           <w:pPr>
-            <w:pStyle w:val="55FD809729B2476C9DFFEFF37A822E7D"/>
+            <w:pStyle w:val="55FD809729B2476C9DFFEFF37A822E7D1"/>
           </w:pPr>
           <w:r>
             <w:rPr>
@@ -19950,7 +20038,7 @@
       <w:docPartBody>
         <w:p>
           <w:pPr>
-            <w:pStyle w:val="21F9DE4366BC4EE888CDEE4DCF6539B8"/>
+            <w:pStyle w:val="21F9DE4366BC4EE888CDEE4DCF6539B81"/>
           </w:pPr>
           <w:r>
             <w:rPr>
@@ -19979,7 +20067,7 @@
       <w:docPartBody>
         <w:p>
           <w:pPr>
-            <w:pStyle w:val="8DA274EC85AE46CDAEE55F8FC081D977"/>
+            <w:pStyle w:val="8DA274EC85AE46CDAEE55F8FC081D9771"/>
           </w:pPr>
           <w:r>
             <w:rPr>
@@ -20008,7 +20096,7 @@
       <w:docPartBody>
         <w:p>
           <w:pPr>
-            <w:pStyle w:val="A33A9B71BA7E4FF98326C6155384BC07"/>
+            <w:pStyle w:val="A33A9B71BA7E4FF98326C6155384BC071"/>
           </w:pPr>
           <w:r>
             <w:rPr>
@@ -20037,7 +20125,7 @@
       <w:docPartBody>
         <w:p>
           <w:pPr>
-            <w:pStyle w:val="79CFAE6BBDB24F1EB6350B88E60B8CE7"/>
+            <w:pStyle w:val="79CFAE6BBDB24F1EB6350B88E60B8CE71"/>
           </w:pPr>
           <w:r>
             <w:rPr>
@@ -20066,7 +20154,7 @@
       <w:docPartBody>
         <w:p>
           <w:pPr>
-            <w:pStyle w:val="54B6B26EE26C4784A9ED807C7EBC2780"/>
+            <w:pStyle w:val="54B6B26EE26C4784A9ED807C7EBC27801"/>
           </w:pPr>
           <w:r>
             <w:rPr>
@@ -20095,11 +20183,12 @@
       <w:docPartBody>
         <w:p>
           <w:pPr>
-            <w:pStyle w:val="66D68240E8A54DFB8DC7CA5EF64DAB7F"/>
+            <w:pStyle w:val="66D68240E8A54DFB8DC7CA5EF64DAB7F1"/>
           </w:pPr>
           <w:r>
             <w:rPr>
               <w:rStyle w:val="Platzhaltertext"/>
+              <w:szCs w:val="18"/>
             </w:rPr>
             <w:t> </w:t>
           </w:r>
@@ -20124,7 +20213,7 @@
       <w:docPartBody>
         <w:p>
           <w:pPr>
-            <w:pStyle w:val="946070A287AE4450A49AA5889EAF9D23"/>
+            <w:pStyle w:val="946070A287AE4450A49AA5889EAF9D231"/>
           </w:pPr>
           <w:r>
             <w:rPr>
@@ -20153,7 +20242,7 @@
       <w:docPartBody>
         <w:p>
           <w:pPr>
-            <w:pStyle w:val="E07FD9CBF4354142816E33D67ADD742F"/>
+            <w:pStyle w:val="E07FD9CBF4354142816E33D67ADD742F1"/>
           </w:pPr>
           <w:r>
             <w:rPr>
@@ -20182,11 +20271,12 @@
       <w:docPartBody>
         <w:p>
           <w:pPr>
-            <w:pStyle w:val="0714A13DBC8E42D28B83D345E26E2EBF"/>
+            <w:pStyle w:val="0714A13DBC8E42D28B83D345E26E2EBF1"/>
           </w:pPr>
           <w:r>
             <w:rPr>
               <w:rStyle w:val="Platzhaltertext"/>
+              <w:szCs w:val="18"/>
             </w:rPr>
             <w:t> </w:t>
           </w:r>
@@ -20211,7 +20301,7 @@
       <w:docPartBody>
         <w:p>
           <w:pPr>
-            <w:pStyle w:val="FBB6F191824F4807B936A0C86F71165F"/>
+            <w:pStyle w:val="FBB6F191824F4807B936A0C86F71165F1"/>
           </w:pPr>
           <w:r>
             <w:rPr>
@@ -20240,7 +20330,7 @@
       <w:docPartBody>
         <w:p>
           <w:pPr>
-            <w:pStyle w:val="64E0A65070914F8289D73CAB25A15006"/>
+            <w:pStyle w:val="64E0A65070914F8289D73CAB25A150061"/>
           </w:pPr>
           <w:r>
             <w:rPr>
@@ -20269,7 +20359,7 @@
       <w:docPartBody>
         <w:p>
           <w:pPr>
-            <w:pStyle w:val="E4335B977D654981A9EE276A00A5AE9E"/>
+            <w:pStyle w:val="E4335B977D654981A9EE276A00A5AE9E1"/>
           </w:pPr>
           <w:r>
             <w:rPr>
@@ -20298,7 +20388,7 @@
       <w:docPartBody>
         <w:p>
           <w:pPr>
-            <w:pStyle w:val="60710702C18549E8A1648E547EE11A4F"/>
+            <w:pStyle w:val="60710702C18549E8A1648E547EE11A4F1"/>
           </w:pPr>
           <w:r>
             <w:rPr>
@@ -20327,7 +20417,7 @@
       <w:docPartBody>
         <w:p>
           <w:pPr>
-            <w:pStyle w:val="CA8D800BEFD3455A8D0D2D1BA02F7404"/>
+            <w:pStyle w:val="CA8D800BEFD3455A8D0D2D1BA02F74041"/>
           </w:pPr>
           <w:r>
             <w:rPr>
@@ -20356,7 +20446,7 @@
       <w:docPartBody>
         <w:p>
           <w:pPr>
-            <w:pStyle w:val="947B6821930740729224E31EB0195806"/>
+            <w:pStyle w:val="947B6821930740729224E31EB01958061"/>
           </w:pPr>
           <w:r>
             <w:rPr>
@@ -20385,7 +20475,7 @@
       <w:docPartBody>
         <w:p>
           <w:pPr>
-            <w:pStyle w:val="E8C83EA403684DF4B144BDAFB387B314"/>
+            <w:pStyle w:val="E8C83EA403684DF4B144BDAFB387B3141"/>
           </w:pPr>
           <w:r>
             <w:rPr>
@@ -20414,7 +20504,7 @@
       <w:docPartBody>
         <w:p>
           <w:pPr>
-            <w:pStyle w:val="1431F370F5344371A3105BE060D3B3FD"/>
+            <w:pStyle w:val="1431F370F5344371A3105BE060D3B3FD1"/>
           </w:pPr>
           <w:r>
             <w:rPr>
@@ -20443,7 +20533,7 @@
       <w:docPartBody>
         <w:p>
           <w:pPr>
-            <w:pStyle w:val="5EA3411357EF476ABD380721323262CA"/>
+            <w:pStyle w:val="5EA3411357EF476ABD380721323262CA1"/>
           </w:pPr>
           <w:r>
             <w:rPr>
@@ -20472,7 +20562,7 @@
       <w:docPartBody>
         <w:p>
           <w:pPr>
-            <w:pStyle w:val="AEDB8930D32348D4A1C11F91A06B104B"/>
+            <w:pStyle w:val="AEDB8930D32348D4A1C11F91A06B104B1"/>
           </w:pPr>
           <w:r>
             <w:rPr>
@@ -20501,7 +20591,7 @@
       <w:docPartBody>
         <w:p>
           <w:pPr>
-            <w:pStyle w:val="E56BB2C965744682855525C71CE32936"/>
+            <w:pStyle w:val="E56BB2C965744682855525C71CE329361"/>
           </w:pPr>
           <w:r>
             <w:rPr>
@@ -20530,7 +20620,7 @@
       <w:docPartBody>
         <w:p>
           <w:pPr>
-            <w:pStyle w:val="D3B5D15BB2854CF09D02E28B458D28D9"/>
+            <w:pStyle w:val="D3B5D15BB2854CF09D02E28B458D28D91"/>
           </w:pPr>
           <w:r>
             <w:rPr>
@@ -20559,7 +20649,7 @@
       <w:docPartBody>
         <w:p>
           <w:pPr>
-            <w:pStyle w:val="375CF79C46ED4CF78842F59D8A817B84"/>
+            <w:pStyle w:val="375CF79C46ED4CF78842F59D8A817B841"/>
           </w:pPr>
           <w:r>
             <w:rPr>
@@ -20588,7 +20678,7 @@
       <w:docPartBody>
         <w:p>
           <w:pPr>
-            <w:pStyle w:val="D4C01324DC4E490E8BCFF9866A039E12"/>
+            <w:pStyle w:val="D4C01324DC4E490E8BCFF9866A039E121"/>
           </w:pPr>
           <w:r>
             <w:rPr>
@@ -20617,7 +20707,7 @@
       <w:docPartBody>
         <w:p>
           <w:pPr>
-            <w:pStyle w:val="95F934C17F5C4EAAA728012CC4320B85"/>
+            <w:pStyle w:val="95F934C17F5C4EAAA728012CC4320B851"/>
           </w:pPr>
           <w:r>
             <w:rPr>
@@ -20646,7 +20736,7 @@
       <w:docPartBody>
         <w:p>
           <w:pPr>
-            <w:pStyle w:val="84F3713A31CA4176932851BB26FEBD42"/>
+            <w:pStyle w:val="84F3713A31CA4176932851BB26FEBD421"/>
           </w:pPr>
           <w:r>
             <w:rPr>
@@ -20675,7 +20765,7 @@
       <w:docPartBody>
         <w:p>
           <w:pPr>
-            <w:pStyle w:val="D22776FFDE864C1B9F0423F341A85A0E"/>
+            <w:pStyle w:val="D22776FFDE864C1B9F0423F341A85A0E1"/>
           </w:pPr>
           <w:r>
             <w:rPr>
@@ -20704,7 +20794,7 @@
       <w:docPartBody>
         <w:p>
           <w:pPr>
-            <w:pStyle w:val="9FB87E13CF464AACB8BA5E9FCB86C6F5"/>
+            <w:pStyle w:val="9FB87E13CF464AACB8BA5E9FCB86C6F51"/>
           </w:pPr>
           <w:r>
             <w:rPr>
@@ -20733,7 +20823,7 @@
       <w:docPartBody>
         <w:p>
           <w:pPr>
-            <w:pStyle w:val="8EF77073325C4AEDB971D7EC7106CA56"/>
+            <w:pStyle w:val="8EF77073325C4AEDB971D7EC7106CA561"/>
           </w:pPr>
           <w:r>
             <w:rPr>
@@ -20762,7 +20852,7 @@
       <w:docPartBody>
         <w:p>
           <w:pPr>
-            <w:pStyle w:val="F76F1FACAFE543069FE8C09E3B55532C"/>
+            <w:pStyle w:val="F76F1FACAFE543069FE8C09E3B55532C1"/>
           </w:pPr>
           <w:r>
             <w:rPr>
@@ -20791,7 +20881,7 @@
       <w:docPartBody>
         <w:p>
           <w:pPr>
-            <w:pStyle w:val="ECA7E55A89E945989AE70C61736FB153"/>
+            <w:pStyle w:val="ECA7E55A89E945989AE70C61736FB1531"/>
           </w:pPr>
           <w:r>
             <w:rPr>
@@ -20820,7 +20910,7 @@
       <w:docPartBody>
         <w:p>
           <w:pPr>
-            <w:pStyle w:val="9E3B286A3DA6476D9FF3F654BC4EFCA7"/>
+            <w:pStyle w:val="9E3B286A3DA6476D9FF3F654BC4EFCA71"/>
           </w:pPr>
           <w:r>
             <w:rPr>
@@ -20849,7 +20939,7 @@
       <w:docPartBody>
         <w:p>
           <w:pPr>
-            <w:pStyle w:val="FF63E3C00A6143678BC985F2818510F3"/>
+            <w:pStyle w:val="FF63E3C00A6143678BC985F2818510F31"/>
           </w:pPr>
           <w:r>
             <w:rPr>
@@ -20878,7 +20968,7 @@
       <w:docPartBody>
         <w:p>
           <w:pPr>
-            <w:pStyle w:val="0360B9682AC743409DE75A36385EBF04"/>
+            <w:pStyle w:val="0360B9682AC743409DE75A36385EBF041"/>
           </w:pPr>
           <w:r>
             <w:rPr>
@@ -20907,7 +20997,7 @@
       <w:docPartBody>
         <w:p>
           <w:pPr>
-            <w:pStyle w:val="9A32D04DA4944ED9AB0C2F49AE926F88"/>
+            <w:pStyle w:val="9A32D04DA4944ED9AB0C2F49AE926F881"/>
           </w:pPr>
           <w:r>
             <w:rPr>
@@ -20936,7 +21026,7 @@
       <w:docPartBody>
         <w:p>
           <w:pPr>
-            <w:pStyle w:val="4070696FA5C4456E82990A03FFEF9320"/>
+            <w:pStyle w:val="4070696FA5C4456E82990A03FFEF93201"/>
           </w:pPr>
           <w:r>
             <w:rPr>
@@ -20965,7 +21055,7 @@
       <w:docPartBody>
         <w:p>
           <w:pPr>
-            <w:pStyle w:val="9BC0C83A33D24D3E93C3645E7840B853"/>
+            <w:pStyle w:val="9BC0C83A33D24D3E93C3645E7840B8531"/>
           </w:pPr>
           <w:r>
             <w:rPr>
@@ -20994,7 +21084,7 @@
       <w:docPartBody>
         <w:p>
           <w:pPr>
-            <w:pStyle w:val="FBD4000DE43C478FA56D069AF38C1BA8"/>
+            <w:pStyle w:val="FBD4000DE43C478FA56D069AF38C1BA81"/>
           </w:pPr>
           <w:r>
             <w:rPr>
@@ -21023,7 +21113,7 @@
       <w:docPartBody>
         <w:p>
           <w:pPr>
-            <w:pStyle w:val="5769E627BFB54878994C8326C4414837"/>
+            <w:pStyle w:val="5769E627BFB54878994C8326C44148371"/>
           </w:pPr>
           <w:r>
             <w:rPr>
@@ -21052,7 +21142,7 @@
       <w:docPartBody>
         <w:p>
           <w:pPr>
-            <w:pStyle w:val="1934D561DAD645FBADEBBF7C3FA76C67"/>
+            <w:pStyle w:val="1934D561DAD645FBADEBBF7C3FA76C671"/>
           </w:pPr>
           <w:r>
             <w:rPr>
@@ -21081,7 +21171,7 @@
       <w:docPartBody>
         <w:p>
           <w:pPr>
-            <w:pStyle w:val="63AFCA9D32E64E50B7A681A0963E081E"/>
+            <w:pStyle w:val="63AFCA9D32E64E50B7A681A0963E081E1"/>
           </w:pPr>
           <w:r>
             <w:rPr>
@@ -21110,7 +21200,7 @@
       <w:docPartBody>
         <w:p>
           <w:pPr>
-            <w:pStyle w:val="DFE77766BFFF40C5908935C1F7729915"/>
+            <w:pStyle w:val="DFE77766BFFF40C5908935C1F77299151"/>
           </w:pPr>
           <w:r>
             <w:rPr>
@@ -21139,7 +21229,7 @@
       <w:docPartBody>
         <w:p>
           <w:pPr>
-            <w:pStyle w:val="14C881618AA94BBA8EE9C879408FD2FC"/>
+            <w:pStyle w:val="14C881618AA94BBA8EE9C879408FD2FC1"/>
           </w:pPr>
           <w:r>
             <w:rPr>
@@ -21168,7 +21258,7 @@
       <w:docPartBody>
         <w:p>
           <w:pPr>
-            <w:pStyle w:val="DBD37D9BB4C04851B7FAA7AC6987AD7E"/>
+            <w:pStyle w:val="DBD37D9BB4C04851B7FAA7AC6987AD7E1"/>
           </w:pPr>
           <w:r>
             <w:rPr>
@@ -21197,7 +21287,7 @@
       <w:docPartBody>
         <w:p>
           <w:pPr>
-            <w:pStyle w:val="0302732F902D48E197BC957807C64C45"/>
+            <w:pStyle w:val="0302732F902D48E197BC957807C64C451"/>
           </w:pPr>
           <w:r>
             <w:rPr>
@@ -21226,7 +21316,7 @@
       <w:docPartBody>
         <w:p>
           <w:pPr>
-            <w:pStyle w:val="6A5ABDA4138A45C4B436C73449A9E00B"/>
+            <w:pStyle w:val="6A5ABDA4138A45C4B436C73449A9E00B1"/>
           </w:pPr>
           <w:r>
             <w:rPr>
@@ -21255,7 +21345,7 @@
       <w:docPartBody>
         <w:p>
           <w:pPr>
-            <w:pStyle w:val="E9CCA20345D94495829094F7E112A59B"/>
+            <w:pStyle w:val="E9CCA20345D94495829094F7E112A59B1"/>
           </w:pPr>
           <w:r>
             <w:rPr>
@@ -21284,7 +21374,7 @@
       <w:docPartBody>
         <w:p>
           <w:pPr>
-            <w:pStyle w:val="58ABB35DE6B945329443A83AA4021D1A"/>
+            <w:pStyle w:val="58ABB35DE6B945329443A83AA4021D1A1"/>
           </w:pPr>
           <w:r>
             <w:rPr>
@@ -21313,7 +21403,7 @@
       <w:docPartBody>
         <w:p>
           <w:pPr>
-            <w:pStyle w:val="7FB04E15C04E46E98A67FC5C9AA260B9"/>
+            <w:pStyle w:val="7FB04E15C04E46E98A67FC5C9AA260B91"/>
           </w:pPr>
           <w:r>
             <w:rPr>
@@ -21342,7 +21432,7 @@
       <w:docPartBody>
         <w:p>
           <w:pPr>
-            <w:pStyle w:val="939E731EC90B4FF8846DFA6311009CD9"/>
+            <w:pStyle w:val="939E731EC90B4FF8846DFA6311009CD91"/>
           </w:pPr>
           <w:r>
             <w:rPr>
@@ -21379,7 +21469,7 @@
       <w:docPartBody>
         <w:p>
           <w:pPr>
-            <w:pStyle w:val="80FDCB92A68F4D0196E92DBC7D2C9FD51"/>
+            <w:pStyle w:val="80FDCB92A68F4D0196E92DBC7D2C9FD5"/>
           </w:pPr>
           <w:r>
             <w:rPr>
@@ -21408,7 +21498,7 @@
       <w:docPartBody>
         <w:p>
           <w:pPr>
-            <w:pStyle w:val="1991F41F44284149BCA57C117EF394421"/>
+            <w:pStyle w:val="1991F41F44284149BCA57C117EF39442"/>
           </w:pPr>
           <w:r>
             <w:rPr>
@@ -21437,7 +21527,7 @@
       <w:docPartBody>
         <w:p>
           <w:pPr>
-            <w:pStyle w:val="10CC256C454E4DDB8D73E7160276CD5E1"/>
+            <w:pStyle w:val="10CC256C454E4DDB8D73E7160276CD5E"/>
           </w:pPr>
           <w:r>
             <w:rPr>
@@ -21560,11 +21650,16 @@
     <w:rsidRoot w:val="00722FB7"/>
     <w:rsid w:val="001E0B90"/>
     <w:rsid w:val="00266B31"/>
+    <w:rsid w:val="00474427"/>
     <w:rsid w:val="00580D0F"/>
+    <w:rsid w:val="00685F69"/>
     <w:rsid w:val="00722FB7"/>
     <w:rsid w:val="00725399"/>
     <w:rsid w:val="00782CB9"/>
     <w:rsid w:val="007A6FA7"/>
+    <w:rsid w:val="008D743C"/>
+    <w:rsid w:val="00A60239"/>
+    <w:rsid w:val="00B73B73"/>
   </w:rsids>
   <m:mathPr>
     <m:mathFont m:val="Cambria Math"/>
@@ -22018,14 +22113,14 @@
     <w:basedOn w:val="Absatz-Standardschriftart"/>
     <w:uiPriority w:val="99"/>
     <w:semiHidden/>
-    <w:rsid w:val="00725399"/>
+    <w:rsid w:val="00474427"/>
     <w:rPr>
       <w:color w:val="808080"/>
     </w:rPr>
   </w:style>
-  <w:style w:type="paragraph" w:customStyle="1" w:styleId="E9D4F7F513954294A3670564F5CB9112">
-    <w:name w:val="E9D4F7F513954294A3670564F5CB9112"/>
-    <w:rsid w:val="00725399"/>
+  <w:style w:type="paragraph" w:customStyle="1" w:styleId="E9D4F7F513954294A3670564F5CB91121">
+    <w:name w:val="E9D4F7F513954294A3670564F5CB91121"/>
+    <w:rsid w:val="00474427"/>
     <w:pPr>
       <w:spacing w:after="0" w:line="248" w:lineRule="exact"/>
     </w:pPr>
@@ -22036,9 +22131,9 @@
       <w:lang w:eastAsia="en-US"/>
     </w:rPr>
   </w:style>
-  <w:style w:type="paragraph" w:customStyle="1" w:styleId="BE90003F78C34049A3BA1AF6E6CEA736">
-    <w:name w:val="BE90003F78C34049A3BA1AF6E6CEA736"/>
-    <w:rsid w:val="00725399"/>
+  <w:style w:type="paragraph" w:customStyle="1" w:styleId="BE90003F78C34049A3BA1AF6E6CEA7361">
+    <w:name w:val="BE90003F78C34049A3BA1AF6E6CEA7361"/>
+    <w:rsid w:val="00474427"/>
     <w:pPr>
       <w:spacing w:after="0" w:line="248" w:lineRule="exact"/>
     </w:pPr>
@@ -22049,9 +22144,9 @@
       <w:lang w:eastAsia="en-US"/>
     </w:rPr>
   </w:style>
-  <w:style w:type="paragraph" w:customStyle="1" w:styleId="1AB9CE3D21E547558004894C440DD168">
-    <w:name w:val="1AB9CE3D21E547558004894C440DD168"/>
-    <w:rsid w:val="00725399"/>
+  <w:style w:type="paragraph" w:customStyle="1" w:styleId="1AB9CE3D21E547558004894C440DD1681">
+    <w:name w:val="1AB9CE3D21E547558004894C440DD1681"/>
+    <w:rsid w:val="00474427"/>
     <w:pPr>
       <w:spacing w:after="0" w:line="248" w:lineRule="exact"/>
     </w:pPr>
@@ -22062,9 +22157,9 @@
       <w:lang w:eastAsia="en-US"/>
     </w:rPr>
   </w:style>
-  <w:style w:type="paragraph" w:customStyle="1" w:styleId="99E0EB8EE80A41A6A50A825E9DA2E490">
-    <w:name w:val="99E0EB8EE80A41A6A50A825E9DA2E490"/>
-    <w:rsid w:val="00725399"/>
+  <w:style w:type="paragraph" w:customStyle="1" w:styleId="99E0EB8EE80A41A6A50A825E9DA2E4901">
+    <w:name w:val="99E0EB8EE80A41A6A50A825E9DA2E4901"/>
+    <w:rsid w:val="00474427"/>
     <w:pPr>
       <w:spacing w:after="0" w:line="248" w:lineRule="exact"/>
     </w:pPr>
@@ -22075,9 +22170,9 @@
       <w:lang w:eastAsia="en-US"/>
     </w:rPr>
   </w:style>
-  <w:style w:type="paragraph" w:customStyle="1" w:styleId="111AEDFC5D75484CA775D522AEA659BD">
-    <w:name w:val="111AEDFC5D75484CA775D522AEA659BD"/>
-    <w:rsid w:val="00725399"/>
+  <w:style w:type="paragraph" w:customStyle="1" w:styleId="111AEDFC5D75484CA775D522AEA659BD1">
+    <w:name w:val="111AEDFC5D75484CA775D522AEA659BD1"/>
+    <w:rsid w:val="00474427"/>
     <w:pPr>
       <w:spacing w:after="0" w:line="248" w:lineRule="exact"/>
     </w:pPr>
@@ -22088,9 +22183,9 @@
       <w:lang w:eastAsia="en-US"/>
     </w:rPr>
   </w:style>
-  <w:style w:type="paragraph" w:customStyle="1" w:styleId="2FAF77FB34F549B3B5DDACE630C75F40">
-    <w:name w:val="2FAF77FB34F549B3B5DDACE630C75F40"/>
-    <w:rsid w:val="00725399"/>
+  <w:style w:type="paragraph" w:customStyle="1" w:styleId="2FAF77FB34F549B3B5DDACE630C75F401">
+    <w:name w:val="2FAF77FB34F549B3B5DDACE630C75F401"/>
+    <w:rsid w:val="00474427"/>
     <w:pPr>
       <w:spacing w:after="0" w:line="248" w:lineRule="exact"/>
     </w:pPr>
@@ -22101,9 +22196,9 @@
       <w:lang w:eastAsia="en-US"/>
     </w:rPr>
   </w:style>
-  <w:style w:type="paragraph" w:customStyle="1" w:styleId="13D9264CC9164A9E976948BC93968586">
-    <w:name w:val="13D9264CC9164A9E976948BC93968586"/>
-    <w:rsid w:val="00725399"/>
+  <w:style w:type="paragraph" w:customStyle="1" w:styleId="13D9264CC9164A9E976948BC939685861">
+    <w:name w:val="13D9264CC9164A9E976948BC939685861"/>
+    <w:rsid w:val="00474427"/>
     <w:pPr>
       <w:spacing w:after="0" w:line="248" w:lineRule="exact"/>
     </w:pPr>
@@ -22114,9 +22209,9 @@
       <w:lang w:eastAsia="en-US"/>
     </w:rPr>
   </w:style>
-  <w:style w:type="paragraph" w:customStyle="1" w:styleId="59340B5617DA409CBA885BD72E32B920">
-    <w:name w:val="59340B5617DA409CBA885BD72E32B920"/>
-    <w:rsid w:val="00725399"/>
+  <w:style w:type="paragraph" w:customStyle="1" w:styleId="59340B5617DA409CBA885BD72E32B9201">
+    <w:name w:val="59340B5617DA409CBA885BD72E32B9201"/>
+    <w:rsid w:val="00474427"/>
     <w:pPr>
       <w:spacing w:after="0" w:line="248" w:lineRule="exact"/>
     </w:pPr>
@@ -22127,9 +22222,9 @@
       <w:lang w:eastAsia="en-US"/>
     </w:rPr>
   </w:style>
-  <w:style w:type="paragraph" w:customStyle="1" w:styleId="5D563D3C40324C75986540AB8D886152">
-    <w:name w:val="5D563D3C40324C75986540AB8D886152"/>
-    <w:rsid w:val="00725399"/>
+  <w:style w:type="paragraph" w:customStyle="1" w:styleId="5D563D3C40324C75986540AB8D8861521">
+    <w:name w:val="5D563D3C40324C75986540AB8D8861521"/>
+    <w:rsid w:val="00474427"/>
     <w:pPr>
       <w:spacing w:after="0" w:line="248" w:lineRule="exact"/>
     </w:pPr>
@@ -22140,9 +22235,9 @@
       <w:lang w:eastAsia="en-US"/>
     </w:rPr>
   </w:style>
-  <w:style w:type="paragraph" w:customStyle="1" w:styleId="66D68240E8A54DFB8DC7CA5EF64DAB7F">
-    <w:name w:val="66D68240E8A54DFB8DC7CA5EF64DAB7F"/>
-    <w:rsid w:val="00725399"/>
+  <w:style w:type="paragraph" w:customStyle="1" w:styleId="66D68240E8A54DFB8DC7CA5EF64DAB7F1">
+    <w:name w:val="66D68240E8A54DFB8DC7CA5EF64DAB7F1"/>
+    <w:rsid w:val="00474427"/>
     <w:pPr>
       <w:tabs>
         <w:tab w:val="left" w:pos="567"/>
@@ -22157,9 +22252,9 @@
       <w:lang w:eastAsia="en-US"/>
     </w:rPr>
   </w:style>
-  <w:style w:type="paragraph" w:customStyle="1" w:styleId="55FD809729B2476C9DFFEFF37A822E7D">
-    <w:name w:val="55FD809729B2476C9DFFEFF37A822E7D"/>
-    <w:rsid w:val="00725399"/>
+  <w:style w:type="paragraph" w:customStyle="1" w:styleId="55FD809729B2476C9DFFEFF37A822E7D1">
+    <w:name w:val="55FD809729B2476C9DFFEFF37A822E7D1"/>
+    <w:rsid w:val="00474427"/>
     <w:pPr>
       <w:tabs>
         <w:tab w:val="left" w:pos="567"/>
@@ -22174,9 +22269,9 @@
       <w:lang w:eastAsia="en-US"/>
     </w:rPr>
   </w:style>
-  <w:style w:type="paragraph" w:customStyle="1" w:styleId="21F9DE4366BC4EE888CDEE4DCF6539B8">
-    <w:name w:val="21F9DE4366BC4EE888CDEE4DCF6539B8"/>
-    <w:rsid w:val="00725399"/>
+  <w:style w:type="paragraph" w:customStyle="1" w:styleId="21F9DE4366BC4EE888CDEE4DCF6539B81">
+    <w:name w:val="21F9DE4366BC4EE888CDEE4DCF6539B81"/>
+    <w:rsid w:val="00474427"/>
     <w:pPr>
       <w:tabs>
         <w:tab w:val="left" w:pos="567"/>
@@ -22191,9 +22286,9 @@
       <w:lang w:eastAsia="en-US"/>
     </w:rPr>
   </w:style>
-  <w:style w:type="paragraph" w:customStyle="1" w:styleId="8DA274EC85AE46CDAEE55F8FC081D977">
-    <w:name w:val="8DA274EC85AE46CDAEE55F8FC081D977"/>
-    <w:rsid w:val="00725399"/>
+  <w:style w:type="paragraph" w:customStyle="1" w:styleId="8DA274EC85AE46CDAEE55F8FC081D9771">
+    <w:name w:val="8DA274EC85AE46CDAEE55F8FC081D9771"/>
+    <w:rsid w:val="00474427"/>
     <w:pPr>
       <w:tabs>
         <w:tab w:val="left" w:pos="567"/>
@@ -22208,9 +22303,9 @@
       <w:lang w:eastAsia="en-US"/>
     </w:rPr>
   </w:style>
-  <w:style w:type="paragraph" w:customStyle="1" w:styleId="A33A9B71BA7E4FF98326C6155384BC07">
-    <w:name w:val="A33A9B71BA7E4FF98326C6155384BC07"/>
-    <w:rsid w:val="00725399"/>
+  <w:style w:type="paragraph" w:customStyle="1" w:styleId="A33A9B71BA7E4FF98326C6155384BC071">
+    <w:name w:val="A33A9B71BA7E4FF98326C6155384BC071"/>
+    <w:rsid w:val="00474427"/>
     <w:pPr>
       <w:tabs>
         <w:tab w:val="left" w:pos="567"/>
@@ -22225,9 +22320,9 @@
       <w:lang w:eastAsia="en-US"/>
     </w:rPr>
   </w:style>
-  <w:style w:type="paragraph" w:customStyle="1" w:styleId="79CFAE6BBDB24F1EB6350B88E60B8CE7">
-    <w:name w:val="79CFAE6BBDB24F1EB6350B88E60B8CE7"/>
-    <w:rsid w:val="00725399"/>
+  <w:style w:type="paragraph" w:customStyle="1" w:styleId="79CFAE6BBDB24F1EB6350B88E60B8CE71">
+    <w:name w:val="79CFAE6BBDB24F1EB6350B88E60B8CE71"/>
+    <w:rsid w:val="00474427"/>
     <w:pPr>
       <w:tabs>
         <w:tab w:val="left" w:pos="567"/>
@@ -22242,9 +22337,9 @@
       <w:lang w:eastAsia="en-US"/>
     </w:rPr>
   </w:style>
-  <w:style w:type="paragraph" w:customStyle="1" w:styleId="54B6B26EE26C4784A9ED807C7EBC2780">
-    <w:name w:val="54B6B26EE26C4784A9ED807C7EBC2780"/>
-    <w:rsid w:val="00725399"/>
+  <w:style w:type="paragraph" w:customStyle="1" w:styleId="54B6B26EE26C4784A9ED807C7EBC27801">
+    <w:name w:val="54B6B26EE26C4784A9ED807C7EBC27801"/>
+    <w:rsid w:val="00474427"/>
     <w:pPr>
       <w:tabs>
         <w:tab w:val="left" w:pos="567"/>
@@ -22259,9 +22354,9 @@
       <w:lang w:eastAsia="en-US"/>
     </w:rPr>
   </w:style>
-  <w:style w:type="paragraph" w:customStyle="1" w:styleId="4E92C4B1DE3F48E79E8F1C3488E31A37">
-    <w:name w:val="4E92C4B1DE3F48E79E8F1C3488E31A37"/>
-    <w:rsid w:val="00725399"/>
+  <w:style w:type="paragraph" w:customStyle="1" w:styleId="4E92C4B1DE3F48E79E8F1C3488E31A371">
+    <w:name w:val="4E92C4B1DE3F48E79E8F1C3488E31A371"/>
+    <w:rsid w:val="00474427"/>
     <w:pPr>
       <w:tabs>
         <w:tab w:val="left" w:pos="567"/>
@@ -22276,9 +22371,9 @@
       <w:lang w:eastAsia="en-US"/>
     </w:rPr>
   </w:style>
-  <w:style w:type="paragraph" w:customStyle="1" w:styleId="946070A287AE4450A49AA5889EAF9D23">
-    <w:name w:val="946070A287AE4450A49AA5889EAF9D23"/>
-    <w:rsid w:val="00725399"/>
+  <w:style w:type="paragraph" w:customStyle="1" w:styleId="946070A287AE4450A49AA5889EAF9D231">
+    <w:name w:val="946070A287AE4450A49AA5889EAF9D231"/>
+    <w:rsid w:val="00474427"/>
     <w:pPr>
       <w:tabs>
         <w:tab w:val="left" w:pos="567"/>
@@ -22293,9 +22388,9 @@
       <w:lang w:eastAsia="en-US"/>
     </w:rPr>
   </w:style>
-  <w:style w:type="paragraph" w:customStyle="1" w:styleId="51C850EA2880437780F2D264505AB36A">
-    <w:name w:val="51C850EA2880437780F2D264505AB36A"/>
-    <w:rsid w:val="00725399"/>
+  <w:style w:type="paragraph" w:customStyle="1" w:styleId="51C850EA2880437780F2D264505AB36A1">
+    <w:name w:val="51C850EA2880437780F2D264505AB36A1"/>
+    <w:rsid w:val="00474427"/>
     <w:pPr>
       <w:tabs>
         <w:tab w:val="left" w:pos="567"/>
@@ -22310,9 +22405,9 @@
       <w:lang w:eastAsia="en-US"/>
     </w:rPr>
   </w:style>
-  <w:style w:type="paragraph" w:customStyle="1" w:styleId="E07FD9CBF4354142816E33D67ADD742F">
-    <w:name w:val="E07FD9CBF4354142816E33D67ADD742F"/>
-    <w:rsid w:val="00725399"/>
+  <w:style w:type="paragraph" w:customStyle="1" w:styleId="E07FD9CBF4354142816E33D67ADD742F1">
+    <w:name w:val="E07FD9CBF4354142816E33D67ADD742F1"/>
+    <w:rsid w:val="00474427"/>
     <w:pPr>
       <w:tabs>
         <w:tab w:val="left" w:pos="567"/>
@@ -22327,9 +22422,9 @@
       <w:lang w:eastAsia="en-US"/>
     </w:rPr>
   </w:style>
-  <w:style w:type="paragraph" w:customStyle="1" w:styleId="0714A13DBC8E42D28B83D345E26E2EBF">
-    <w:name w:val="0714A13DBC8E42D28B83D345E26E2EBF"/>
-    <w:rsid w:val="00725399"/>
+  <w:style w:type="paragraph" w:customStyle="1" w:styleId="0714A13DBC8E42D28B83D345E26E2EBF1">
+    <w:name w:val="0714A13DBC8E42D28B83D345E26E2EBF1"/>
+    <w:rsid w:val="00474427"/>
     <w:pPr>
       <w:tabs>
         <w:tab w:val="left" w:pos="567"/>
@@ -22344,9 +22439,9 @@
       <w:lang w:eastAsia="en-US"/>
     </w:rPr>
   </w:style>
-  <w:style w:type="paragraph" w:customStyle="1" w:styleId="FBB6F191824F4807B936A0C86F71165F">
-    <w:name w:val="FBB6F191824F4807B936A0C86F71165F"/>
-    <w:rsid w:val="00725399"/>
+  <w:style w:type="paragraph" w:customStyle="1" w:styleId="FBB6F191824F4807B936A0C86F71165F1">
+    <w:name w:val="FBB6F191824F4807B936A0C86F71165F1"/>
+    <w:rsid w:val="00474427"/>
     <w:pPr>
       <w:tabs>
         <w:tab w:val="left" w:pos="567"/>
@@ -22361,9 +22456,9 @@
       <w:lang w:eastAsia="en-US"/>
     </w:rPr>
   </w:style>
-  <w:style w:type="paragraph" w:customStyle="1" w:styleId="64E0A65070914F8289D73CAB25A15006">
-    <w:name w:val="64E0A65070914F8289D73CAB25A15006"/>
-    <w:rsid w:val="00725399"/>
+  <w:style w:type="paragraph" w:customStyle="1" w:styleId="64E0A65070914F8289D73CAB25A150061">
+    <w:name w:val="64E0A65070914F8289D73CAB25A150061"/>
+    <w:rsid w:val="00474427"/>
     <w:pPr>
       <w:tabs>
         <w:tab w:val="left" w:pos="567"/>
@@ -22378,9 +22473,9 @@
       <w:lang w:eastAsia="en-US"/>
     </w:rPr>
   </w:style>
-  <w:style w:type="paragraph" w:customStyle="1" w:styleId="E4335B977D654981A9EE276A00A5AE9E">
-    <w:name w:val="E4335B977D654981A9EE276A00A5AE9E"/>
-    <w:rsid w:val="00725399"/>
+  <w:style w:type="paragraph" w:customStyle="1" w:styleId="E4335B977D654981A9EE276A00A5AE9E1">
+    <w:name w:val="E4335B977D654981A9EE276A00A5AE9E1"/>
+    <w:rsid w:val="00474427"/>
     <w:pPr>
       <w:tabs>
         <w:tab w:val="left" w:pos="567"/>
@@ -22395,9 +22490,9 @@
       <w:lang w:eastAsia="en-US"/>
     </w:rPr>
   </w:style>
-  <w:style w:type="paragraph" w:customStyle="1" w:styleId="60710702C18549E8A1648E547EE11A4F">
-    <w:name w:val="60710702C18549E8A1648E547EE11A4F"/>
-    <w:rsid w:val="00725399"/>
+  <w:style w:type="paragraph" w:customStyle="1" w:styleId="60710702C18549E8A1648E547EE11A4F1">
+    <w:name w:val="60710702C18549E8A1648E547EE11A4F1"/>
+    <w:rsid w:val="00474427"/>
     <w:pPr>
       <w:tabs>
         <w:tab w:val="left" w:pos="567"/>
@@ -22412,9 +22507,9 @@
       <w:lang w:eastAsia="en-US"/>
     </w:rPr>
   </w:style>
-  <w:style w:type="paragraph" w:customStyle="1" w:styleId="CA8D800BEFD3455A8D0D2D1BA02F7404">
-    <w:name w:val="CA8D800BEFD3455A8D0D2D1BA02F7404"/>
-    <w:rsid w:val="00725399"/>
+  <w:style w:type="paragraph" w:customStyle="1" w:styleId="CA8D800BEFD3455A8D0D2D1BA02F74041">
+    <w:name w:val="CA8D800BEFD3455A8D0D2D1BA02F74041"/>
+    <w:rsid w:val="00474427"/>
     <w:pPr>
       <w:tabs>
         <w:tab w:val="left" w:pos="567"/>
@@ -22429,9 +22524,9 @@
       <w:lang w:eastAsia="en-US"/>
     </w:rPr>
   </w:style>
-  <w:style w:type="paragraph" w:customStyle="1" w:styleId="947B6821930740729224E31EB0195806">
-    <w:name w:val="947B6821930740729224E31EB0195806"/>
-    <w:rsid w:val="00725399"/>
+  <w:style w:type="paragraph" w:customStyle="1" w:styleId="947B6821930740729224E31EB01958061">
+    <w:name w:val="947B6821930740729224E31EB01958061"/>
+    <w:rsid w:val="00474427"/>
     <w:pPr>
       <w:tabs>
         <w:tab w:val="left" w:pos="567"/>
@@ -22446,9 +22541,9 @@
       <w:lang w:eastAsia="en-US"/>
     </w:rPr>
   </w:style>
-  <w:style w:type="paragraph" w:customStyle="1" w:styleId="E8C83EA403684DF4B144BDAFB387B314">
-    <w:name w:val="E8C83EA403684DF4B144BDAFB387B314"/>
-    <w:rsid w:val="00725399"/>
+  <w:style w:type="paragraph" w:customStyle="1" w:styleId="E8C83EA403684DF4B144BDAFB387B3141">
+    <w:name w:val="E8C83EA403684DF4B144BDAFB387B3141"/>
+    <w:rsid w:val="00474427"/>
     <w:pPr>
       <w:tabs>
         <w:tab w:val="left" w:pos="567"/>
@@ -22463,9 +22558,9 @@
       <w:lang w:eastAsia="en-US"/>
     </w:rPr>
   </w:style>
-  <w:style w:type="paragraph" w:customStyle="1" w:styleId="1431F370F5344371A3105BE060D3B3FD">
-    <w:name w:val="1431F370F5344371A3105BE060D3B3FD"/>
-    <w:rsid w:val="00725399"/>
+  <w:style w:type="paragraph" w:customStyle="1" w:styleId="1431F370F5344371A3105BE060D3B3FD1">
+    <w:name w:val="1431F370F5344371A3105BE060D3B3FD1"/>
+    <w:rsid w:val="00474427"/>
     <w:pPr>
       <w:tabs>
         <w:tab w:val="left" w:pos="567"/>
@@ -22480,9 +22575,9 @@
       <w:lang w:eastAsia="en-US"/>
     </w:rPr>
   </w:style>
-  <w:style w:type="paragraph" w:customStyle="1" w:styleId="5EA3411357EF476ABD380721323262CA">
-    <w:name w:val="5EA3411357EF476ABD380721323262CA"/>
-    <w:rsid w:val="00725399"/>
+  <w:style w:type="paragraph" w:customStyle="1" w:styleId="5EA3411357EF476ABD380721323262CA1">
+    <w:name w:val="5EA3411357EF476ABD380721323262CA1"/>
+    <w:rsid w:val="00474427"/>
     <w:pPr>
       <w:tabs>
         <w:tab w:val="left" w:pos="567"/>
@@ -22497,9 +22592,9 @@
       <w:lang w:eastAsia="en-US"/>
     </w:rPr>
   </w:style>
-  <w:style w:type="paragraph" w:customStyle="1" w:styleId="AEDB8930D32348D4A1C11F91A06B104B">
-    <w:name w:val="AEDB8930D32348D4A1C11F91A06B104B"/>
-    <w:rsid w:val="00725399"/>
+  <w:style w:type="paragraph" w:customStyle="1" w:styleId="AEDB8930D32348D4A1C11F91A06B104B1">
+    <w:name w:val="AEDB8930D32348D4A1C11F91A06B104B1"/>
+    <w:rsid w:val="00474427"/>
     <w:pPr>
       <w:tabs>
         <w:tab w:val="left" w:pos="567"/>
@@ -22514,9 +22609,9 @@
       <w:lang w:eastAsia="en-US"/>
     </w:rPr>
   </w:style>
-  <w:style w:type="paragraph" w:customStyle="1" w:styleId="E56BB2C965744682855525C71CE32936">
-    <w:name w:val="E56BB2C965744682855525C71CE32936"/>
-    <w:rsid w:val="00725399"/>
+  <w:style w:type="paragraph" w:customStyle="1" w:styleId="E56BB2C965744682855525C71CE329361">
+    <w:name w:val="E56BB2C965744682855525C71CE329361"/>
+    <w:rsid w:val="00474427"/>
     <w:pPr>
       <w:tabs>
         <w:tab w:val="left" w:pos="567"/>
@@ -22531,9 +22626,9 @@
       <w:lang w:eastAsia="en-US"/>
     </w:rPr>
   </w:style>
-  <w:style w:type="paragraph" w:customStyle="1" w:styleId="D3B5D15BB2854CF09D02E28B458D28D9">
-    <w:name w:val="D3B5D15BB2854CF09D02E28B458D28D9"/>
-    <w:rsid w:val="00725399"/>
+  <w:style w:type="paragraph" w:customStyle="1" w:styleId="D3B5D15BB2854CF09D02E28B458D28D91">
+    <w:name w:val="D3B5D15BB2854CF09D02E28B458D28D91"/>
+    <w:rsid w:val="00474427"/>
     <w:pPr>
       <w:tabs>
         <w:tab w:val="left" w:pos="567"/>
@@ -22548,9 +22643,9 @@
       <w:lang w:eastAsia="en-US"/>
     </w:rPr>
   </w:style>
-  <w:style w:type="paragraph" w:customStyle="1" w:styleId="375CF79C46ED4CF78842F59D8A817B84">
-    <w:name w:val="375CF79C46ED4CF78842F59D8A817B84"/>
-    <w:rsid w:val="00725399"/>
+  <w:style w:type="paragraph" w:customStyle="1" w:styleId="375CF79C46ED4CF78842F59D8A817B841">
+    <w:name w:val="375CF79C46ED4CF78842F59D8A817B841"/>
+    <w:rsid w:val="00474427"/>
     <w:pPr>
       <w:tabs>
         <w:tab w:val="left" w:pos="567"/>
@@ -22565,9 +22660,9 @@
       <w:lang w:eastAsia="en-US"/>
     </w:rPr>
   </w:style>
-  <w:style w:type="paragraph" w:customStyle="1" w:styleId="D4C01324DC4E490E8BCFF9866A039E12">
-    <w:name w:val="D4C01324DC4E490E8BCFF9866A039E12"/>
-    <w:rsid w:val="00725399"/>
+  <w:style w:type="paragraph" w:customStyle="1" w:styleId="D4C01324DC4E490E8BCFF9866A039E121">
+    <w:name w:val="D4C01324DC4E490E8BCFF9866A039E121"/>
+    <w:rsid w:val="00474427"/>
     <w:pPr>
       <w:tabs>
         <w:tab w:val="left" w:pos="567"/>
@@ -22582,9 +22677,9 @@
       <w:lang w:eastAsia="en-US"/>
     </w:rPr>
   </w:style>
-  <w:style w:type="paragraph" w:customStyle="1" w:styleId="95F934C17F5C4EAAA728012CC4320B85">
-    <w:name w:val="95F934C17F5C4EAAA728012CC4320B85"/>
-    <w:rsid w:val="00725399"/>
+  <w:style w:type="paragraph" w:customStyle="1" w:styleId="95F934C17F5C4EAAA728012CC4320B851">
+    <w:name w:val="95F934C17F5C4EAAA728012CC4320B851"/>
+    <w:rsid w:val="00474427"/>
     <w:pPr>
       <w:tabs>
         <w:tab w:val="left" w:pos="567"/>
@@ -22599,9 +22694,9 @@
       <w:lang w:eastAsia="en-US"/>
     </w:rPr>
   </w:style>
-  <w:style w:type="paragraph" w:customStyle="1" w:styleId="84F3713A31CA4176932851BB26FEBD42">
-    <w:name w:val="84F3713A31CA4176932851BB26FEBD42"/>
-    <w:rsid w:val="00725399"/>
+  <w:style w:type="paragraph" w:customStyle="1" w:styleId="84F3713A31CA4176932851BB26FEBD421">
+    <w:name w:val="84F3713A31CA4176932851BB26FEBD421"/>
+    <w:rsid w:val="00474427"/>
     <w:pPr>
       <w:tabs>
         <w:tab w:val="left" w:pos="567"/>
@@ -22616,9 +22711,9 @@
       <w:lang w:eastAsia="en-US"/>
     </w:rPr>
   </w:style>
-  <w:style w:type="paragraph" w:customStyle="1" w:styleId="D22776FFDE864C1B9F0423F341A85A0E">
-    <w:name w:val="D22776FFDE864C1B9F0423F341A85A0E"/>
-    <w:rsid w:val="00725399"/>
+  <w:style w:type="paragraph" w:customStyle="1" w:styleId="D22776FFDE864C1B9F0423F341A85A0E1">
+    <w:name w:val="D22776FFDE864C1B9F0423F341A85A0E1"/>
+    <w:rsid w:val="00474427"/>
     <w:pPr>
       <w:tabs>
         <w:tab w:val="left" w:pos="567"/>
@@ -22633,9 +22728,9 @@
       <w:lang w:eastAsia="en-US"/>
     </w:rPr>
   </w:style>
-  <w:style w:type="paragraph" w:customStyle="1" w:styleId="9FB87E13CF464AACB8BA5E9FCB86C6F5">
-    <w:name w:val="9FB87E13CF464AACB8BA5E9FCB86C6F5"/>
-    <w:rsid w:val="00725399"/>
+  <w:style w:type="paragraph" w:customStyle="1" w:styleId="9FB87E13CF464AACB8BA5E9FCB86C6F51">
+    <w:name w:val="9FB87E13CF464AACB8BA5E9FCB86C6F51"/>
+    <w:rsid w:val="00474427"/>
     <w:pPr>
       <w:tabs>
         <w:tab w:val="left" w:pos="567"/>
@@ -22650,9 +22745,9 @@
       <w:lang w:eastAsia="en-US"/>
     </w:rPr>
   </w:style>
-  <w:style w:type="paragraph" w:customStyle="1" w:styleId="8EF77073325C4AEDB971D7EC7106CA56">
-    <w:name w:val="8EF77073325C4AEDB971D7EC7106CA56"/>
-    <w:rsid w:val="00725399"/>
+  <w:style w:type="paragraph" w:customStyle="1" w:styleId="8EF77073325C4AEDB971D7EC7106CA561">
+    <w:name w:val="8EF77073325C4AEDB971D7EC7106CA561"/>
+    <w:rsid w:val="00474427"/>
     <w:pPr>
       <w:tabs>
         <w:tab w:val="left" w:pos="567"/>
@@ -22667,9 +22762,9 @@
       <w:lang w:eastAsia="en-US"/>
     </w:rPr>
   </w:style>
-  <w:style w:type="paragraph" w:customStyle="1" w:styleId="F76F1FACAFE543069FE8C09E3B55532C">
-    <w:name w:val="F76F1FACAFE543069FE8C09E3B55532C"/>
-    <w:rsid w:val="00725399"/>
+  <w:style w:type="paragraph" w:customStyle="1" w:styleId="F76F1FACAFE543069FE8C09E3B55532C1">
+    <w:name w:val="F76F1FACAFE543069FE8C09E3B55532C1"/>
+    <w:rsid w:val="00474427"/>
     <w:pPr>
       <w:tabs>
         <w:tab w:val="left" w:pos="567"/>
@@ -22684,9 +22779,9 @@
       <w:lang w:eastAsia="en-US"/>
     </w:rPr>
   </w:style>
-  <w:style w:type="paragraph" w:customStyle="1" w:styleId="ECA7E55A89E945989AE70C61736FB153">
-    <w:name w:val="ECA7E55A89E945989AE70C61736FB153"/>
-    <w:rsid w:val="00725399"/>
+  <w:style w:type="paragraph" w:customStyle="1" w:styleId="ECA7E55A89E945989AE70C61736FB1531">
+    <w:name w:val="ECA7E55A89E945989AE70C61736FB1531"/>
+    <w:rsid w:val="00474427"/>
     <w:pPr>
       <w:tabs>
         <w:tab w:val="left" w:pos="567"/>
@@ -22701,9 +22796,9 @@
       <w:lang w:eastAsia="en-US"/>
     </w:rPr>
   </w:style>
-  <w:style w:type="paragraph" w:customStyle="1" w:styleId="9E3B286A3DA6476D9FF3F654BC4EFCA7">
-    <w:name w:val="9E3B286A3DA6476D9FF3F654BC4EFCA7"/>
-    <w:rsid w:val="00725399"/>
+  <w:style w:type="paragraph" w:customStyle="1" w:styleId="9E3B286A3DA6476D9FF3F654BC4EFCA71">
+    <w:name w:val="9E3B286A3DA6476D9FF3F654BC4EFCA71"/>
+    <w:rsid w:val="00474427"/>
     <w:pPr>
       <w:tabs>
         <w:tab w:val="left" w:pos="567"/>
@@ -22718,9 +22813,9 @@
       <w:lang w:eastAsia="en-US"/>
     </w:rPr>
   </w:style>
-  <w:style w:type="paragraph" w:customStyle="1" w:styleId="FF63E3C00A6143678BC985F2818510F3">
-    <w:name w:val="FF63E3C00A6143678BC985F2818510F3"/>
-    <w:rsid w:val="00725399"/>
+  <w:style w:type="paragraph" w:customStyle="1" w:styleId="FF63E3C00A6143678BC985F2818510F31">
+    <w:name w:val="FF63E3C00A6143678BC985F2818510F31"/>
+    <w:rsid w:val="00474427"/>
     <w:pPr>
       <w:tabs>
         <w:tab w:val="left" w:pos="567"/>
@@ -22735,9 +22830,9 @@
       <w:lang w:eastAsia="en-US"/>
     </w:rPr>
   </w:style>
-  <w:style w:type="paragraph" w:customStyle="1" w:styleId="0360B9682AC743409DE75A36385EBF04">
-    <w:name w:val="0360B9682AC743409DE75A36385EBF04"/>
-    <w:rsid w:val="00725399"/>
+  <w:style w:type="paragraph" w:customStyle="1" w:styleId="0360B9682AC743409DE75A36385EBF041">
+    <w:name w:val="0360B9682AC743409DE75A36385EBF041"/>
+    <w:rsid w:val="00474427"/>
     <w:pPr>
       <w:tabs>
         <w:tab w:val="left" w:pos="567"/>
@@ -22752,9 +22847,9 @@
       <w:lang w:eastAsia="en-US"/>
     </w:rPr>
   </w:style>
-  <w:style w:type="paragraph" w:customStyle="1" w:styleId="9A32D04DA4944ED9AB0C2F49AE926F88">
-    <w:name w:val="9A32D04DA4944ED9AB0C2F49AE926F88"/>
-    <w:rsid w:val="00725399"/>
+  <w:style w:type="paragraph" w:customStyle="1" w:styleId="9A32D04DA4944ED9AB0C2F49AE926F881">
+    <w:name w:val="9A32D04DA4944ED9AB0C2F49AE926F881"/>
+    <w:rsid w:val="00474427"/>
     <w:pPr>
       <w:tabs>
         <w:tab w:val="left" w:pos="567"/>
@@ -22769,9 +22864,9 @@
       <w:lang w:eastAsia="en-US"/>
     </w:rPr>
   </w:style>
-  <w:style w:type="paragraph" w:customStyle="1" w:styleId="4070696FA5C4456E82990A03FFEF9320">
-    <w:name w:val="4070696FA5C4456E82990A03FFEF9320"/>
-    <w:rsid w:val="00725399"/>
+  <w:style w:type="paragraph" w:customStyle="1" w:styleId="4070696FA5C4456E82990A03FFEF93201">
+    <w:name w:val="4070696FA5C4456E82990A03FFEF93201"/>
+    <w:rsid w:val="00474427"/>
     <w:pPr>
       <w:tabs>
         <w:tab w:val="left" w:pos="567"/>
@@ -22786,9 +22881,9 @@
       <w:lang w:eastAsia="en-US"/>
     </w:rPr>
   </w:style>
-  <w:style w:type="paragraph" w:customStyle="1" w:styleId="9BC0C83A33D24D3E93C3645E7840B853">
-    <w:name w:val="9BC0C83A33D24D3E93C3645E7840B853"/>
-    <w:rsid w:val="00725399"/>
+  <w:style w:type="paragraph" w:customStyle="1" w:styleId="9BC0C83A33D24D3E93C3645E7840B8531">
+    <w:name w:val="9BC0C83A33D24D3E93C3645E7840B8531"/>
+    <w:rsid w:val="00474427"/>
     <w:pPr>
       <w:tabs>
         <w:tab w:val="left" w:pos="567"/>
@@ -22803,9 +22898,9 @@
       <w:lang w:eastAsia="en-US"/>
     </w:rPr>
   </w:style>
-  <w:style w:type="paragraph" w:customStyle="1" w:styleId="FBD4000DE43C478FA56D069AF38C1BA8">
-    <w:name w:val="FBD4000DE43C478FA56D069AF38C1BA8"/>
-    <w:rsid w:val="00725399"/>
+  <w:style w:type="paragraph" w:customStyle="1" w:styleId="FBD4000DE43C478FA56D069AF38C1BA81">
+    <w:name w:val="FBD4000DE43C478FA56D069AF38C1BA81"/>
+    <w:rsid w:val="00474427"/>
     <w:pPr>
       <w:tabs>
         <w:tab w:val="left" w:pos="567"/>
@@ -22820,9 +22915,9 @@
       <w:lang w:eastAsia="en-US"/>
     </w:rPr>
   </w:style>
-  <w:style w:type="paragraph" w:customStyle="1" w:styleId="5769E627BFB54878994C8326C4414837">
-    <w:name w:val="5769E627BFB54878994C8326C4414837"/>
-    <w:rsid w:val="00725399"/>
+  <w:style w:type="paragraph" w:customStyle="1" w:styleId="5769E627BFB54878994C8326C44148371">
+    <w:name w:val="5769E627BFB54878994C8326C44148371"/>
+    <w:rsid w:val="00474427"/>
     <w:pPr>
       <w:tabs>
         <w:tab w:val="left" w:pos="567"/>
@@ -22837,9 +22932,9 @@
       <w:lang w:eastAsia="en-US"/>
     </w:rPr>
   </w:style>
-  <w:style w:type="paragraph" w:customStyle="1" w:styleId="1934D561DAD645FBADEBBF7C3FA76C67">
-    <w:name w:val="1934D561DAD645FBADEBBF7C3FA76C67"/>
-    <w:rsid w:val="00725399"/>
+  <w:style w:type="paragraph" w:customStyle="1" w:styleId="1934D561DAD645FBADEBBF7C3FA76C671">
+    <w:name w:val="1934D561DAD645FBADEBBF7C3FA76C671"/>
+    <w:rsid w:val="00474427"/>
     <w:pPr>
       <w:tabs>
         <w:tab w:val="left" w:pos="567"/>
@@ -22854,9 +22949,9 @@
       <w:lang w:eastAsia="en-US"/>
     </w:rPr>
   </w:style>
-  <w:style w:type="paragraph" w:customStyle="1" w:styleId="63AFCA9D32E64E50B7A681A0963E081E">
-    <w:name w:val="63AFCA9D32E64E50B7A681A0963E081E"/>
-    <w:rsid w:val="00725399"/>
+  <w:style w:type="paragraph" w:customStyle="1" w:styleId="63AFCA9D32E64E50B7A681A0963E081E1">
+    <w:name w:val="63AFCA9D32E64E50B7A681A0963E081E1"/>
+    <w:rsid w:val="00474427"/>
     <w:pPr>
       <w:tabs>
         <w:tab w:val="left" w:pos="567"/>
@@ -22871,9 +22966,9 @@
       <w:lang w:eastAsia="en-US"/>
     </w:rPr>
   </w:style>
-  <w:style w:type="paragraph" w:customStyle="1" w:styleId="DFE77766BFFF40C5908935C1F7729915">
-    <w:name w:val="DFE77766BFFF40C5908935C1F7729915"/>
-    <w:rsid w:val="00725399"/>
+  <w:style w:type="paragraph" w:customStyle="1" w:styleId="DFE77766BFFF40C5908935C1F77299151">
+    <w:name w:val="DFE77766BFFF40C5908935C1F77299151"/>
+    <w:rsid w:val="00474427"/>
     <w:pPr>
       <w:tabs>
         <w:tab w:val="left" w:pos="567"/>
@@ -22888,9 +22983,9 @@
       <w:lang w:eastAsia="en-US"/>
     </w:rPr>
   </w:style>
-  <w:style w:type="paragraph" w:customStyle="1" w:styleId="14C881618AA94BBA8EE9C879408FD2FC">
-    <w:name w:val="14C881618AA94BBA8EE9C879408FD2FC"/>
-    <w:rsid w:val="00725399"/>
+  <w:style w:type="paragraph" w:customStyle="1" w:styleId="14C881618AA94BBA8EE9C879408FD2FC1">
+    <w:name w:val="14C881618AA94BBA8EE9C879408FD2FC1"/>
+    <w:rsid w:val="00474427"/>
     <w:pPr>
       <w:tabs>
         <w:tab w:val="left" w:pos="567"/>
@@ -22905,9 +23000,9 @@
       <w:lang w:eastAsia="en-US"/>
     </w:rPr>
   </w:style>
-  <w:style w:type="paragraph" w:customStyle="1" w:styleId="DBD37D9BB4C04851B7FAA7AC6987AD7E">
-    <w:name w:val="DBD37D9BB4C04851B7FAA7AC6987AD7E"/>
-    <w:rsid w:val="00725399"/>
+  <w:style w:type="paragraph" w:customStyle="1" w:styleId="DBD37D9BB4C04851B7FAA7AC6987AD7E1">
+    <w:name w:val="DBD37D9BB4C04851B7FAA7AC6987AD7E1"/>
+    <w:rsid w:val="00474427"/>
     <w:pPr>
       <w:tabs>
         <w:tab w:val="left" w:pos="567"/>
@@ -22922,9 +23017,9 @@
       <w:lang w:eastAsia="en-US"/>
     </w:rPr>
   </w:style>
-  <w:style w:type="paragraph" w:customStyle="1" w:styleId="0302732F902D48E197BC957807C64C45">
-    <w:name w:val="0302732F902D48E197BC957807C64C45"/>
-    <w:rsid w:val="00725399"/>
+  <w:style w:type="paragraph" w:customStyle="1" w:styleId="0302732F902D48E197BC957807C64C451">
+    <w:name w:val="0302732F902D48E197BC957807C64C451"/>
+    <w:rsid w:val="00474427"/>
     <w:pPr>
       <w:tabs>
         <w:tab w:val="left" w:pos="567"/>
@@ -22939,9 +23034,9 @@
       <w:lang w:eastAsia="en-US"/>
     </w:rPr>
   </w:style>
-  <w:style w:type="paragraph" w:customStyle="1" w:styleId="6A5ABDA4138A45C4B436C73449A9E00B">
-    <w:name w:val="6A5ABDA4138A45C4B436C73449A9E00B"/>
-    <w:rsid w:val="00725399"/>
+  <w:style w:type="paragraph" w:customStyle="1" w:styleId="6A5ABDA4138A45C4B436C73449A9E00B1">
+    <w:name w:val="6A5ABDA4138A45C4B436C73449A9E00B1"/>
+    <w:rsid w:val="00474427"/>
     <w:pPr>
       <w:tabs>
         <w:tab w:val="left" w:pos="567"/>
@@ -22956,9 +23051,9 @@
       <w:lang w:eastAsia="en-US"/>
     </w:rPr>
   </w:style>
-  <w:style w:type="paragraph" w:customStyle="1" w:styleId="E9CCA20345D94495829094F7E112A59B">
-    <w:name w:val="E9CCA20345D94495829094F7E112A59B"/>
-    <w:rsid w:val="00725399"/>
+  <w:style w:type="paragraph" w:customStyle="1" w:styleId="E9CCA20345D94495829094F7E112A59B1">
+    <w:name w:val="E9CCA20345D94495829094F7E112A59B1"/>
+    <w:rsid w:val="00474427"/>
     <w:pPr>
       <w:tabs>
         <w:tab w:val="left" w:pos="567"/>
@@ -22973,9 +23068,9 @@
       <w:lang w:eastAsia="en-US"/>
     </w:rPr>
   </w:style>
-  <w:style w:type="paragraph" w:customStyle="1" w:styleId="58ABB35DE6B945329443A83AA4021D1A">
-    <w:name w:val="58ABB35DE6B945329443A83AA4021D1A"/>
-    <w:rsid w:val="00725399"/>
+  <w:style w:type="paragraph" w:customStyle="1" w:styleId="58ABB35DE6B945329443A83AA4021D1A1">
+    <w:name w:val="58ABB35DE6B945329443A83AA4021D1A1"/>
+    <w:rsid w:val="00474427"/>
     <w:pPr>
       <w:tabs>
         <w:tab w:val="left" w:pos="567"/>
@@ -22990,9 +23085,9 @@
       <w:lang w:eastAsia="en-US"/>
     </w:rPr>
   </w:style>
-  <w:style w:type="paragraph" w:customStyle="1" w:styleId="7FB04E15C04E46E98A67FC5C9AA260B9">
-    <w:name w:val="7FB04E15C04E46E98A67FC5C9AA260B9"/>
-    <w:rsid w:val="00725399"/>
+  <w:style w:type="paragraph" w:customStyle="1" w:styleId="7FB04E15C04E46E98A67FC5C9AA260B91">
+    <w:name w:val="7FB04E15C04E46E98A67FC5C9AA260B91"/>
+    <w:rsid w:val="00474427"/>
     <w:pPr>
       <w:tabs>
         <w:tab w:val="left" w:pos="567"/>
@@ -23007,9 +23102,9 @@
       <w:lang w:eastAsia="en-US"/>
     </w:rPr>
   </w:style>
-  <w:style w:type="paragraph" w:customStyle="1" w:styleId="939E731EC90B4FF8846DFA6311009CD9">
-    <w:name w:val="939E731EC90B4FF8846DFA6311009CD9"/>
-    <w:rsid w:val="00725399"/>
+  <w:style w:type="paragraph" w:customStyle="1" w:styleId="939E731EC90B4FF8846DFA6311009CD91">
+    <w:name w:val="939E731EC90B4FF8846DFA6311009CD91"/>
+    <w:rsid w:val="00474427"/>
     <w:pPr>
       <w:spacing w:after="0" w:line="248" w:lineRule="exact"/>
     </w:pPr>
@@ -23020,9 +23115,9 @@
       <w:lang w:eastAsia="en-US"/>
     </w:rPr>
   </w:style>
-  <w:style w:type="paragraph" w:customStyle="1" w:styleId="80FDCB92A68F4D0196E92DBC7D2C9FD51">
-    <w:name w:val="80FDCB92A68F4D0196E92DBC7D2C9FD51"/>
-    <w:rsid w:val="00725399"/>
+  <w:style w:type="paragraph" w:customStyle="1" w:styleId="80FDCB92A68F4D0196E92DBC7D2C9FD5">
+    <w:name w:val="80FDCB92A68F4D0196E92DBC7D2C9FD5"/>
+    <w:rsid w:val="00474427"/>
     <w:pPr>
       <w:tabs>
         <w:tab w:val="left" w:pos="567"/>
@@ -23037,9 +23132,9 @@
       <w:lang w:eastAsia="en-US"/>
     </w:rPr>
   </w:style>
-  <w:style w:type="paragraph" w:customStyle="1" w:styleId="1991F41F44284149BCA57C117EF394421">
-    <w:name w:val="1991F41F44284149BCA57C117EF394421"/>
-    <w:rsid w:val="00725399"/>
+  <w:style w:type="paragraph" w:customStyle="1" w:styleId="1991F41F44284149BCA57C117EF39442">
+    <w:name w:val="1991F41F44284149BCA57C117EF39442"/>
+    <w:rsid w:val="00474427"/>
     <w:pPr>
       <w:tabs>
         <w:tab w:val="left" w:pos="567"/>
@@ -23054,9 +23149,9 @@
       <w:lang w:eastAsia="en-US"/>
     </w:rPr>
   </w:style>
-  <w:style w:type="paragraph" w:customStyle="1" w:styleId="10CC256C454E4DDB8D73E7160276CD5E1">
-    <w:name w:val="10CC256C454E4DDB8D73E7160276CD5E1"/>
-    <w:rsid w:val="00725399"/>
+  <w:style w:type="paragraph" w:customStyle="1" w:styleId="10CC256C454E4DDB8D73E7160276CD5E">
+    <w:name w:val="10CC256C454E4DDB8D73E7160276CD5E"/>
+    <w:rsid w:val="00474427"/>
     <w:pPr>
       <w:tabs>
         <w:tab w:val="left" w:pos="567"/>

</xml_diff>